<commit_message>
Yöntemi ve bilimsel karşılaştırmayı geliştir, yerel parça kontrollerini kaydet
</commit_message>
<xml_diff>
--- a/docs/2209-A/ARASTIRMA_ONERISI_BIRLESIK_TASLAK.docx
+++ b/docs/2209-A/ARASTIRMA_ONERISI_BIRLESIK_TASLAK.docx
@@ -2,7 +2,7 @@
 <file path=word/document.xml><?xml version="1.0" encoding="utf-8"?>
 <w:document xmlns:w="http://schemas.openxmlformats.org/wordprocessingml/2006/main" xmlns:m="http://schemas.openxmlformats.org/officeDocument/2006/math" xmlns:r="http://schemas.openxmlformats.org/officeDocument/2006/relationships" xmlns:o="urn:schemas-microsoft-com:office:office" xmlns:v="urn:schemas-microsoft-com:vml" xmlns:w10="urn:schemas-microsoft-com:office:word" xmlns:a="http://schemas.openxmlformats.org/drawingml/2006/main" xmlns:pic="http://schemas.openxmlformats.org/drawingml/2006/picture" xmlns:wp="http://schemas.openxmlformats.org/drawingml/2006/wordprocessingDrawing">
   <w:body>
-    <w:bookmarkStart w:id="58" w:name="tübitak-2209-a-araştırma-önerisi"/>
+    <w:bookmarkStart w:id="59" w:name="tübitak-2209-a-araştırma-önerisi"/>
     <w:p>
       <w:pPr>
         <w:pStyle w:val="Heading1"/>
@@ -20,7 +20,7 @@
           <w:b/>
           <w:bCs/>
         </w:rPr>
-        <w:t xml:space="preserve">İlk birleşik metin taslağı · 22 Ekim 2026</w:t>
+        <w:t xml:space="preserve">Birleşik metin taslağı · 22 Ekim 2026 · Yöntem ve kaynakça güncellemesi</w:t>
       </w:r>
     </w:p>
     <w:p>
@@ -565,7 +565,15 @@
         <w:pStyle w:val="BodyText"/>
       </w:pPr>
       <w:r>
-        <w:t xml:space="preserve">İlgili uygulamalarda Iqbal vd. (2023), yapı modelinden çıkarılan koordinatların masaüstü uygulaması ve bulut bağlantısı üzerinden ESP32 tabanlı bir mobil robota aktarılmasıyla zemin çizimi gerçekleştiren bir sistem sunmuştur. Rodrigues vd. (2026) ise enkoderler, dış kamera temelli konum bilgisi ve ESP32 gömülü kontrol katmanını içeren küçük bir diferansiyel sürüşlü robotta yörünge takibini deneysel olarak değerlendirmiştir. Bu örnekler, koordinat aktarımı, konum bilgisi ve motor kontrolünün farklı mimarilerle bütünleştirilebildiğini göstermektedir. Önerilen projede ele alınacak değerlendirme görevi, kullanıcının tanımladığı rota üzerinde yerel algıyla engelden kaçınma ve rotaya yeniden katılmadır. Çalışmanın bilimsel çerçevesi, bu davranışın seçilen donanım ve sınırlı deney koşullarında hangi aşamalarda başarılı veya başarısız olduğunun tekrarlı ölçümlerle incelenmesine dayanmaktadır.</w:t>
+        <w:t xml:space="preserve">Engelden kaçınmaya ilişkin deneysel bir uygulamada Alajlan vd. (2017), FEZ Cerbot platformunda kızılötesi sensörler, ultrasonik sensör ve araç üzeri kamerayı birleştirerek sabit ve kısmen dinamik engelli senaryoları incelemiştir. Bu çalışma, algılama kapsamının ve birden çok sensörden gelen bilginin hareket kararlarıyla birlikte ele alınmasına örnektir. Önerilen projede beş sabit mesafe sensörüyle sınırlı algılama düzeni ve sabit engeller üzerinde çalışılacak; mevcut telefon araç üzerinde engel algılayan kamera olarak değil, hareketi bağımsız değerlendiren ölçüm aracı olarak planlanacaktır. Anılan çalışmanın yol/enerji performansı ve farklı algılama altyapısı bu araca aktarılmış sonuç olarak kullanılmayacaktır.</w:t>
+      </w:r>
+    </w:p>
+    <w:p>
+      <w:pPr>
+        <w:pStyle w:val="BodyText"/>
+      </w:pPr>
+      <w:r>
+        <w:t xml:space="preserve">Koordinat tabanlı uygulamalarda Iqbal vd. (2023), yapı modelinden çıkarılan koordinatların masaüstü uygulaması ve bulut bağlantısı üzerinden ESP32 tabanlı bir mobil robota aktarılmasıyla zemin çizimi gerçekleştiren bir sistem sunmuştur. Rodrigues vd. (2026) ise enkoderler, dış kamera temelli konum bilgisi ve ESP32 gömülü kontrol katmanını içeren küçük bir diferansiyel sürüşlü robotta yörünge takibini deneysel olarak değerlendirmiştir. Bu örnekler, koordinat aktarımı, konum bilgisi ve motor kontrolünün farklı mimarilerle bütünleştirilebildiğini göstermektedir. Önerilen projede ele alınacak değerlendirme görevi, kullanıcının tanımladığı rota üzerinde yerel algıyla engelden kaçınma ve rotaya yeniden katılmadır. Çalışmanın bilimsel çerçevesi, bu davranışın seçilen donanım ve sınırlı deney koşullarında hangi aşamalarda başarılı veya başarısız olduğunun tekrarlı ölçümlerle incelenmesine dayanmaktadır.</w:t>
       </w:r>
     </w:p>
     <w:p>
@@ -864,7 +872,7 @@
         <w:pStyle w:val="BodyText"/>
       </w:pPr>
       <w:r>
-        <w:t xml:space="preserve">Rota araca yüklendikten sonra algılama ve hareket kararlarının araç üzerinde yürütülmesi planlanmaktadır. Arayüzde tahmini konum, sensör geçerlilik bilgisi ve görev durumu gösterilecektir. Bağlantı kesilmesi, sensör hatası, durdurma komutu ve ilerleyememe durumlarının davranışları uygulama öncesinde tanımlanacak ve denenecektir. Kesin arayüz teknolojisi ve ağ çalışma modu henüz seçilmemiştir.</w:t>
+        <w:t xml:space="preserve">Rota araca yüklendikten sonra algılama ve hareket kararlarının araç üzerinde yürütülmesi planlanmaktadır. Arayüzde tahmini konum, sensör geçerlilik bilgisi ve görev durumu gösterilecektir. Bağlantı kesilmesi, sensör hatası, durdurma komutu ve ilerleyememe durumlarının davranışları uygulama öncesinde tanımlanacak ve denenecektir. Rota yüklenirken alan dışındaki noktalar ve sıfır uzunluklu ardışık parçalar reddedilecektir. Kesin arayüz teknolojisi ve ağ çalışma modu henüz seçilmemiştir.</w:t>
       </w:r>
     </w:p>
     <w:bookmarkEnd w:id="30"/>
@@ -882,7 +890,7 @@
         <w:pStyle w:val="FirstParagraph"/>
       </w:pPr>
       <w:r>
-        <w:t xml:space="preserve">Taslak yöntem önerisi, Bug 2 yaklaşımının hedef doğrultusunu izleme, engel çevresini takip etme ve uygun koşullarda doğrultuya yeniden katılma mantığını bir durum makinesine uyarlamaktır (Hauser, t.y.-a). Kesin algoritma kararı henüz verilmemiştir. Her ardışık waypoint çifti için aktif bir rota parçası tanımlanacak; rota izleme, engel tespiti, kaçınma ve rotaya katılma durumları ayrı yürütülecektir.</w:t>
+        <w:t xml:space="preserve">Algoritma adayı, Bug 2 yaklaşımının rota izleme, engel çevresini takip etme ve hedef doğrultusuna yeniden katılma mantığını durum makinesiyle uygulamaktır (Hauser, t.y.-a). Her iki ardışık waypoint arasında bir başlangıç–hedef doğrultusu tanımlanacaktır. Engel tespit edildiğinde araç, algılama ve durma mesafesine uygun biçimde yavaşlatılacak veya durdurulacak; temas gerçekleşmeden kaçınma durumuna geçilecektir. Yerel mesafe ölçümlerine göre engel çevresi izlenirken seçilen izleme yönü ve açıklık korunmaya çalışılacaktır.</w:t>
       </w:r>
     </w:p>
     <w:p>
@@ -890,7 +898,7 @@
         <w:pStyle w:val="BodyText"/>
       </w:pPr>
       <w:r>
-        <w:t xml:space="preserve">Engel algılandığında araç, toplam algılama/karar gecikmesi ve ölçülmüş durma mesafesi dikkate alınarak yavaşlatılacak veya durdurulacaktır. Ardından mesafe ölçümleriyle engel çevresini takip ederek geçiş açıklığını korumaya çalışacaktır. Rotaya katılmada aktif rota parçasına uzaklık, hedefe yaklaşma, engelin geride bırakılması ve ilerleme yönündeki açıklık birlikte değerlendirilecektir. Rota çizgisinin bir kez kesilmesi tek başına başarılı dönüş sayılmayacaktır.</w:t>
+        <w:t xml:space="preserve">Arayüzden yüklenen waypoint sırası korunacaktır. Engel görüldüğünde etkin hedef değiştirilmeden kaçınmaya başlama konumu ve hedefe uzaklık kaydedilecektir. Araç kaçınma sırasında en yakın waypoint’e atlatılmayacak; etkin hedefe tolerans içinde erişmeden sonraki waypoint’e geçilmeyecektir. Başlangıç konumu/yönü işaretli referansa göre kurulacak ve her deneme için enkoder başlangıcı kaydedilecektir.</w:t>
       </w:r>
     </w:p>
     <w:p>
@@ -898,7 +906,49 @@
         <w:pStyle w:val="BodyText"/>
       </w:pPr>
       <w:r>
-        <w:t xml:space="preserve">Aracın gövde boyutları, dönüşte kapladığı alan ve sensörlerin gövdeye göre konumu dikkate alınacaktır. Teorik noktasal robot varsayımlarından gerçek araç için koşulsuz başarı sonucu çıkarılmayacaktır. Aynı bölgede ilerleyememe, geçersiz veri, alan sınırına yaklaşma ve süre aşımı durdurma/başarısızlık nedeni olarak kaydedilecektir.</w:t>
+        <w:t xml:space="preserve">Rotaya katılma için aracın aktif</w:t>
+      </w:r>
+      <w:r>
+        <w:t xml:space="preserve"> </w:t>
+      </w:r>
+      <w:r>
+        <w:rPr>
+          <w:b/>
+          <w:bCs/>
+        </w:rPr>
+        <w:t xml:space="preserve">sonlu rota parçasına</w:t>
+      </w:r>
+      <w:r>
+        <w:t xml:space="preserve"> </w:t>
+      </w:r>
+      <w:r>
+        <w:t xml:space="preserve">belirlenen tolerans içinde ulaşması, hedefe uzaklığının kaçınmaya başladığı noktaya göre ölçüm belirsizliğinden büyük bir payla azalması, engelin geride bırakılması ve gövde için ilerleme açıklığının yeterli olması birlikte değerlendirilecektir. Kaçınma boyunca seçilen kenar izleme yönü, geçiş kuralı olmadan sürekli değiştirilerek salınım oluşturmayacaktır. Rota çizgisinin bir kez kesilmesi yeterli sayılmayacak; katılma bandında kalma ve hedef yönünde ilerlemeyi sürdürme kontrol edilecektir. Kesin açıklık, süre ve ilerleme payları kalibrasyondan önce ölçülmüş değer gibi yazılmayacaktır.</w:t>
+      </w:r>
+    </w:p>
+    <w:p>
+      <w:pPr>
+        <w:pStyle w:val="BodyText"/>
+      </w:pPr>
+      <w:r>
+        <w:t xml:space="preserve">Bu uygulama, Bug 2 mantığından yararlanan gerçek araç uyarlamasıdır; ideal algoritmanın eksiksiz uygulandığı veya teorik tamlık garantisinin sağlandığı iddia edilmeyecektir. Aynı bölgede ilerleyememe, döngü şüphesi, geçersiz sensör verisi, alan sınırına yaklaşma veya süre sınırının aşılması durumlarında deneme durdurulup nedeni kaydedilecektir. Durdurma kaydı</w:t>
+      </w:r>
+      <w:r>
+        <w:t xml:space="preserve"> </w:t>
+      </w:r>
+      <w:r>
+        <w:t xml:space="preserve">“</w:t>
+      </w:r>
+      <w:r>
+        <w:t xml:space="preserve">bu düzenekte tamamlanamadı</w:t>
+      </w:r>
+      <w:r>
+        <w:t xml:space="preserve">”</w:t>
+      </w:r>
+      <w:r>
+        <w:t xml:space="preserve"> </w:t>
+      </w:r>
+      <w:r>
+        <w:t xml:space="preserve">anlamındadır; ortamda hiçbir geçerli yol bulunmadığının kanıtı sayılmayacaktır. Gerçek aracın genişliği, dönüş kabiliyeti, kısıtlı sensör kapsaması ve konum hatası tasarımda dikkate alınacaktır.</w:t>
       </w:r>
     </w:p>
     <w:p>
@@ -1483,6 +1533,152 @@
       </w:pPr>
       <w:r>
         <w:t xml:space="preserve">Çarpışma, kontrol kesintisi, ilerleyememe ve süre aşımı gibi geçerli başarısızlıklar paydada tutulacaktır. Yalnızca önceden tanımlanmış, araç davranışından bağımsız kayıt/düzenek hataları nedeniyle değerlendirilemeyen denemeler gerekçeleriyle ayrılabilecektir. Yazılım veya donanım değişirse sürüm ve neden kaydedilecek; karşılaştırılan koşullar aynı son sürümle değerlendirilecektir. Bu tekrar planından bütün kullanım ortamlarına başarı veya istatistiksel anlamlılık sonucu çıkarılmayacaktır.</w:t>
+      </w:r>
+    </w:p>
+    <w:p>
+      <w:pPr>
+        <w:pStyle w:val="BodyText"/>
+      </w:pPr>
+      <w:r>
+        <w:t xml:space="preserve">Bağımsız değerlendirmede aktif rota parçası, waypoint’lere sıralı erişimin görüntüden doğrulanmasına göre belirlenecektir. Ölçülen araç referans noktasının bu sonlu parçadaki en yakın noktaya uzaklığı rota hatası olarak alınacaktır; parçanın sonsuz uzantısına uzaklık yeterli sayılmayacaktır. Geçerli ve eşit zaman aralığına getirilmiş izleme örneklerinde kök ortalama karesel hata (RMSE) hesaplanacaktır:</w:t>
+      </w:r>
+    </w:p>
+    <w:p>
+      <w:pPr>
+        <w:pStyle w:val="BodyText"/>
+      </w:pPr>
+      <m:oMathPara>
+        <m:oMathParaPr>
+          <m:jc m:val="center"/>
+        </m:oMathParaPr>
+        <m:oMath>
+          <m:r>
+            <m:rPr>
+              <m:sty m:val="p"/>
+            </m:rPr>
+            <m:t>RMSE</m:t>
+          </m:r>
+          <m:r>
+            <m:rPr>
+              <m:sty m:val="p"/>
+            </m:rPr>
+            <m:t>=</m:t>
+          </m:r>
+          <m:rad>
+            <m:radPr>
+              <m:degHide m:val="on"/>
+            </m:radPr>
+            <m:deg/>
+            <m:e>
+              <m:f>
+                <m:fPr>
+                  <m:type m:val="bar"/>
+                </m:fPr>
+                <m:num>
+                  <m:r>
+                    <m:t>1</m:t>
+                  </m:r>
+                </m:num>
+                <m:den>
+                  <m:r>
+                    <m:t>N</m:t>
+                  </m:r>
+                </m:den>
+              </m:f>
+              <m:nary>
+                <m:naryPr>
+                  <m:chr m:val="∑"/>
+                  <m:limLoc m:val="undOvr"/>
+                  <m:subHide m:val="off"/>
+                  <m:supHide m:val="off"/>
+                </m:naryPr>
+                <m:sub>
+                  <m:r>
+                    <m:t>i</m:t>
+                  </m:r>
+                  <m:r>
+                    <m:rPr>
+                      <m:sty m:val="p"/>
+                    </m:rPr>
+                    <m:t>=</m:t>
+                  </m:r>
+                  <m:r>
+                    <m:t>1</m:t>
+                  </m:r>
+                </m:sub>
+                <m:sup>
+                  <m:r>
+                    <m:t>N</m:t>
+                  </m:r>
+                </m:sup>
+                <m:e>
+                  <m:sSubSup>
+                    <m:e>
+                      <m:r>
+                        <m:t>e</m:t>
+                      </m:r>
+                    </m:e>
+                    <m:sub>
+                      <m:r>
+                        <m:t>i</m:t>
+                      </m:r>
+                    </m:sub>
+                    <m:sup>
+                      <m:r>
+                        <m:t>2</m:t>
+                      </m:r>
+                    </m:sup>
+                  </m:sSubSup>
+                </m:e>
+              </m:nary>
+            </m:e>
+          </m:rad>
+        </m:oMath>
+      </m:oMathPara>
+    </w:p>
+    <w:p>
+      <w:pPr>
+        <w:pStyle w:val="FirstParagraph"/>
+      </w:pPr>
+      <w:r>
+        <w:t xml:space="preserve">Burada</w:t>
+      </w:r>
+      <w:r>
+        <w:t xml:space="preserve"> </w:t>
+      </w:r>
+      <m:oMath>
+        <m:sSub>
+          <m:e>
+            <m:r>
+              <m:t>e</m:t>
+            </m:r>
+          </m:e>
+          <m:sub>
+            <m:r>
+              <m:t>i</m:t>
+            </m:r>
+          </m:sub>
+        </m:sSub>
+      </m:oMath>
+      <w:r>
+        <w:t xml:space="preserve"> </w:t>
+      </w:r>
+      <w:r>
+        <w:t xml:space="preserve">bağımsız ölçülen konumun referans parçaya uzaklığı,</w:t>
+      </w:r>
+      <w:r>
+        <w:t xml:space="preserve"> </w:t>
+      </w:r>
+      <m:oMath>
+        <m:r>
+          <m:t>N</m:t>
+        </m:r>
+      </m:oMath>
+      <w:r>
+        <w:t xml:space="preserve"> </w:t>
+      </w:r>
+      <w:r>
+        <w:t xml:space="preserve">değerlendirilen konum örneği sayısıdır. Örnekleme aralığı ve veri kapsamı raporlanacak; kayıp görüntü aralıkları sonuç iyileştirmek için doldurulmayacaktır. Temas ve algılama olaylarının sırası zaman eşleme belirsizliği nedeniyle ayırt edilemiyorsa olay başarılı algılama diye işaretlenmeyecektir.</w:t>
       </w:r>
     </w:p>
     <w:bookmarkEnd w:id="40"/>
@@ -3305,7 +3501,7 @@
       </w:r>
     </w:p>
     <w:bookmarkEnd w:id="49"/>
-    <w:bookmarkStart w:id="56" w:name="kaynakça"/>
+    <w:bookmarkStart w:id="57" w:name="kaynakça"/>
     <w:p>
       <w:pPr>
         <w:pStyle w:val="Heading2"/>
@@ -3313,6 +3509,59 @@
       </w:pPr>
       <w:r>
         <w:t xml:space="preserve">Kaynakça</w:t>
+      </w:r>
+    </w:p>
+    <w:p>
+      <w:pPr>
+        <w:numPr>
+          <w:ilvl w:val="0"/>
+          <w:numId w:val="1002"/>
+        </w:numPr>
+      </w:pPr>
+      <w:r>
+        <w:t xml:space="preserve">Alajlan, A., Elleithy, K., Almasri, M., Sobh, T. 2017.</w:t>
+      </w:r>
+      <w:r>
+        <w:t xml:space="preserve"> </w:t>
+      </w:r>
+      <w:r>
+        <w:t xml:space="preserve">“</w:t>
+      </w:r>
+      <w:r>
+        <w:t xml:space="preserve">An Optimal and Energy Efficient Multi-Sensor Collision-Free Path Planning Algorithm for a Mobile Robot in Dynamic Environments</w:t>
+      </w:r>
+      <w:r>
+        <w:t xml:space="preserve">”</w:t>
+      </w:r>
+      <w:r>
+        <w:t xml:space="preserve">,</w:t>
+      </w:r>
+      <w:r>
+        <w:t xml:space="preserve"> </w:t>
+      </w:r>
+      <w:r>
+        <w:rPr>
+          <w:i/>
+          <w:iCs/>
+        </w:rPr>
+        <w:t xml:space="preserve">Robotics</w:t>
+      </w:r>
+      <w:r>
+        <w:t xml:space="preserve">, 6(2), 7. DOI:</w:t>
+      </w:r>
+      <w:r>
+        <w:t xml:space="preserve"> </w:t>
+      </w:r>
+      <w:hyperlink r:id="rId50">
+        <w:r>
+          <w:rPr>
+            <w:rStyle w:val="Hyperlink"/>
+          </w:rPr>
+          <w:t xml:space="preserve">https://doi.org/10.3390/robotics6020007</w:t>
+        </w:r>
+      </w:hyperlink>
+      <w:r>
+        <w:t xml:space="preserve">.</w:t>
       </w:r>
     </w:p>
     <w:p>
@@ -3356,7 +3605,7 @@
       <w:r>
         <w:t xml:space="preserve"> </w:t>
       </w:r>
-      <w:hyperlink r:id="rId50">
+      <w:hyperlink r:id="rId51">
         <w:r>
           <w:rPr>
             <w:rStyle w:val="Hyperlink"/>
@@ -3409,7 +3658,7 @@
       <w:r>
         <w:t xml:space="preserve"> </w:t>
       </w:r>
-      <w:hyperlink r:id="rId51">
+      <w:hyperlink r:id="rId52">
         <w:r>
           <w:rPr>
             <w:rStyle w:val="Hyperlink"/>
@@ -3462,7 +3711,7 @@
       <w:r>
         <w:t xml:space="preserve"> </w:t>
       </w:r>
-      <w:hyperlink r:id="rId52">
+      <w:hyperlink r:id="rId53">
         <w:r>
           <w:rPr>
             <w:rStyle w:val="Hyperlink"/>
@@ -3515,7 +3764,7 @@
       <w:r>
         <w:t xml:space="preserve"> </w:t>
       </w:r>
-      <w:hyperlink r:id="rId53">
+      <w:hyperlink r:id="rId54">
         <w:r>
           <w:rPr>
             <w:rStyle w:val="Hyperlink"/>
@@ -3568,7 +3817,7 @@
       <w:r>
         <w:t xml:space="preserve"> </w:t>
       </w:r>
-      <w:hyperlink r:id="rId54">
+      <w:hyperlink r:id="rId55">
         <w:r>
           <w:rPr>
             <w:rStyle w:val="Hyperlink"/>
@@ -3621,7 +3870,7 @@
       <w:r>
         <w:t xml:space="preserve"> </w:t>
       </w:r>
-      <w:hyperlink r:id="rId55">
+      <w:hyperlink r:id="rId56">
         <w:r>
           <w:rPr>
             <w:rStyle w:val="Hyperlink"/>
@@ -3633,8 +3882,8 @@
         <w:t xml:space="preserve">.</w:t>
       </w:r>
     </w:p>
-    <w:bookmarkEnd w:id="56"/>
-    <w:bookmarkStart w:id="57" w:name="Xf464aa70f1a7e1b641d77641e8e8c98cdbde733"/>
+    <w:bookmarkEnd w:id="57"/>
+    <w:bookmarkStart w:id="58" w:name="Xf464aa70f1a7e1b641d77641e8e8c98cdbde733"/>
     <w:p>
       <w:pPr>
         <w:pStyle w:val="Heading2"/>
@@ -3750,8 +3999,8 @@
         <w:t xml:space="preserve">ChatGPT/Codex; kaynak inceleme desteği, taslakların hazırlanması/düzenlenmesi ve belge oluşturma için; image_gen üç tasarım şemasının üretilmesi için kullanılmıştır. Araç sürümü görünmüyorsa tahmin edilmeyecektir. Başvuru sistemindeki beyan alanı gerçek kullanım kapsamıyla doldurulacak; içerik yürütücü ve danışman tarafından kontrol edilecektir.</w:t>
       </w:r>
     </w:p>
-    <w:bookmarkEnd w:id="57"/>
     <w:bookmarkEnd w:id="58"/>
+    <w:bookmarkEnd w:id="59"/>
     <w:sectPr>
       <w:headerReference r:id="rId9" w:type="default"/>
       <w:footerReference r:id="rId10" w:type="default"/>

</xml_diff>

<commit_message>
Başvuru metninin anlatımını düzenle ve hazırlık notlarını ayır
</commit_message>
<xml_diff>
--- a/docs/2209-A/ARASTIRMA_ONERISI_BIRLESIK_TASLAK.docx
+++ b/docs/2209-A/ARASTIRMA_ONERISI_BIRLESIK_TASLAK.docx
@@ -20,7 +20,7 @@
           <w:b/>
           <w:bCs/>
         </w:rPr>
-        <w:t xml:space="preserve">Birleşik metin taslağı · 22 Ekim 2026 · Yöntem ve kaynakça güncellemesi</w:t>
+        <w:t xml:space="preserve">Birleşik metin taslağı · 22 Ekim 2026 · Dil ve anlatım düzenlemesi</w:t>
       </w:r>
     </w:p>
     <w:p>
@@ -46,10 +46,27 @@
         <w:pStyle w:val="BodyText"/>
       </w:pPr>
       <w:r>
-        <w:t xml:space="preserve">Bu belge planlanan araştırmanın ilk birleşik taslağıdır. Prototip ve deneyler henüz yapılmamıştır. Deney yeri belli değildir; açık bilgiler son bölümde toplanmıştır.</w:t>
+        <w:t xml:space="preserve">Bu belge, planlanan araştırmanın inceleme taslağıdır. Başvuru öncesinde tamamlanacak bilgiler ve belge hazırlama kayıtları</w:t>
+      </w:r>
+      <w:r>
+        <w:t xml:space="preserve"> </w:t>
+      </w:r>
+      <w:hyperlink r:id="rId20">
+        <w:r>
+          <w:rPr>
+            <w:rStyle w:val="Hyperlink"/>
+          </w:rPr>
+          <w:t xml:space="preserve">ayrı hazırlık notunda</w:t>
+        </w:r>
+      </w:hyperlink>
+      <w:r>
+        <w:t xml:space="preserve"> </w:t>
+      </w:r>
+      <w:r>
+        <w:t xml:space="preserve">tutulmaktadır.</w:t>
       </w:r>
     </w:p>
-    <w:bookmarkStart w:id="20" w:name="genel-bilgiler"/>
+    <w:bookmarkStart w:id="21" w:name="genel-bilgiler"/>
     <w:p>
       <w:pPr>
         <w:pStyle w:val="Heading2"/>
@@ -464,8 +481,8 @@
         </w:tc>
       </w:tr>
     </w:tbl>
-    <w:bookmarkEnd w:id="20"/>
-    <w:bookmarkStart w:id="21" w:name="özet"/>
+    <w:bookmarkEnd w:id="21"/>
+    <w:bookmarkStart w:id="22" w:name="özet"/>
     <w:p>
       <w:pPr>
         <w:pStyle w:val="Heading2"/>
@@ -487,7 +504,7 @@
         <w:pStyle w:val="BodyText"/>
       </w:pPr>
       <w:r>
-        <w:t xml:space="preserve">Prototip, ESP32 kontrol birimi, bağımsız sürülen iki enkoderli motor ve ön orta, iki ön çapraz ile iki yan yönünde yerleştirilecek beş sabit mesafe sensörü üzerine kurulacaktır. Kullanıcı, bilgisayar öncelikli ve telefondan erişimi de hedeflenen arayüzde yerel koordinatlarla ara rota noktaları belirleyecektir. Enkoder geri bildirimiyle göreli konum kestirimi ve mesafe ölçümlerine dayalı kaçınma davranışı bütünleştirilecektir. Kaçınma için Bug 2 mantığından yararlanan bir durum makinesi, taslak yöntem olarak değerlendirilmektedir.</w:t>
+        <w:t xml:space="preserve">Prototip; ESP32 kontrol birimi, bağımsız sürülen iki enkoderli motor ve ön orta, iki ön çapraz ve iki yan yönde yerleştirilecek beş sabit mesafe sensöründen oluşacaktır. Kullanıcı, bilgisayar öncelikli ve telefondan erişimi de hedeflenen arayüzde yerel koordinatlarla ara rota noktaları (waypoint) belirleyecektir. Enkoder verilerinden hesaplanan göreli konum bilgisi, mesafe ölçümlerine dayalı hareket kararlarıyla birlikte kullanılacaktır. Engel çevresini takip etme ve rotaya dönüş davranışları, Bug 2 yaklaşımından yararlanan bir durum makinesiyle gerçekleştirilecektir.</w:t>
       </w:r>
     </w:p>
     <w:p>
@@ -524,8 +541,8 @@
         <w:t xml:space="preserve">Otonom kara aracı, rota takibi, engelden kaçınma, enkoder, gömülü kontrol.</w:t>
       </w:r>
     </w:p>
-    <w:bookmarkEnd w:id="21"/>
-    <w:bookmarkStart w:id="24" w:name="bilimsel-nitelik"/>
+    <w:bookmarkEnd w:id="22"/>
+    <w:bookmarkStart w:id="25" w:name="bilimsel-nitelik"/>
     <w:p>
       <w:pPr>
         <w:pStyle w:val="Heading2"/>
@@ -535,7 +552,7 @@
         <w:t xml:space="preserve">1. Bilimsel nitelik</w:t>
       </w:r>
     </w:p>
-    <w:bookmarkStart w:id="22" w:name="X2d024c15c071b3cb5d3e99d34387eb7593d965e"/>
+    <w:bookmarkStart w:id="23" w:name="X2d024c15c071b3cb5d3e99d34387eb7593d965e"/>
     <w:p>
       <w:pPr>
         <w:pStyle w:val="Heading3"/>
@@ -565,7 +582,7 @@
         <w:pStyle w:val="BodyText"/>
       </w:pPr>
       <w:r>
-        <w:t xml:space="preserve">Engelden kaçınmaya ilişkin deneysel bir uygulamada Alajlan vd. (2017), FEZ Cerbot platformunda kızılötesi sensörler, ultrasonik sensör ve araç üzeri kamerayı birleştirerek sabit ve kısmen dinamik engelli senaryoları incelemiştir. Bu çalışma, algılama kapsamının ve birden çok sensörden gelen bilginin hareket kararlarıyla birlikte ele alınmasına örnektir. Önerilen projede beş sabit mesafe sensörüyle sınırlı algılama düzeni ve sabit engeller üzerinde çalışılacak; mevcut telefon araç üzerinde engel algılayan kamera olarak değil, hareketi bağımsız değerlendiren ölçüm aracı olarak planlanacaktır. Anılan çalışmanın yol/enerji performansı ve farklı algılama altyapısı bu araca aktarılmış sonuç olarak kullanılmayacaktır.</w:t>
+        <w:t xml:space="preserve">Alajlan vd. (2017), FEZ Cerbot platformunda kızılötesi sensörler, ultrasonik sensör ve araç üzeri kamerayı birleştirerek sabit ve kısmen dinamik engelli senaryoları incelemiştir. Bu çalışma, algılama kapsamının hareket kararlarıyla birlikte tasarlanmasına örnek oluşturmaktadır. Bu araştırmada ise beş sabit mesafe sensörünün sağladığı yerel bilgiyle sabit engeller çevresinde kaçınma davranışı değerlendirilecektir. Telefonla yapılacak görüntü kaydı, aracın hareketini bağımsız olarak ölçmek amacıyla kullanılacaktır. Algılama altyapısı ve deney koşulları farklı olduğundan, ilgili yayındaki performans sonuçları bu prototip için öngörülen başarı değerleri olarak alınmayacaktır.</w:t>
       </w:r>
     </w:p>
     <w:p>
@@ -581,7 +598,7 @@
         <w:pStyle w:val="BodyText"/>
       </w:pPr>
       <w:r>
-        <w:t xml:space="preserve">Bu projede ele alınacak problem, kullanıcı tarafından belirlenen waypoint rotasında ilerleyen mikrodenetleyici tabanlı bir kara aracının, farklı yerleşimlerdeki sabit engelleri algılayarak çarpışmasız kaçınma hareketi gerçekleştirmesi ve ardından rotasına yeniden katılmasıdır. Çalışma, düz zeminde yaklaşık 3 × 3 metre olarak planlanan kontrollü bir deney alanıyla sınırlandırılacaktır. Rota, bilgisayar öncelikli ve telefondan erişimi de hedeflenen kullanıcı arayüzündeki ölçülü kareli alan üzerinde tanımlanacaktır. Deneylerde engellerin yerleşimleri değiştirilecek; algılama, çarpışmasız kaçınma, rotaya dönüş ve görev tamamlama davranışları ayrı ayrı değerlendirilecektir.</w:t>
+        <w:t xml:space="preserve">Araştırma problemi, mikrodenetleyici tabanlı bir aracın kullanıcı tanımlı rotada karşılaştığı sabit engelleri aşarak aynı rota üzerindeki görevini sürdürebilmesidir. Bu problem, düz zeminde yaklaşık 3 × 3 metre olarak planlanan kontrollü alanda incelenecektir. Aynı referans rota üzerinde engelin yeri değiştirilerek algılama, kaçınma, rotaya dönüş ve görevi tamamlama aşamalarındaki başarı ve başarısızlıklar karşılaştırılacaktır.</w:t>
       </w:r>
     </w:p>
     <w:p>
@@ -610,8 +627,8 @@
         <w:t xml:space="preserve">biçiminde ele alınmaktadır. Geliştirilecek prototip üzerinde tekrarlanabilir deneyler gerçekleştirilmesi, başarılı ve başarısız durumların kaydedilmesi ve performansın ölçülebilir göstergelerle açıklanması amaçlanmaktadır. Kalibrasyon ve değerlendirmede güvenilir referans ölçümleri kullanılması, sensör çıktıları ile fiziksel hareket arasındaki ilişkinin incelenmesine dayanak sağlayacaktır (Hauser, t.y.-b). Bu kapsamda beklenen katkı; kullanıcı arayüzü, gömülü kontrol ve engelden kaçınma davranışının bütünleştirildiği bir prototip ile sınırları tanımlı deney koşullarına ait performans verilerinin oluşturulmasıdır.</w:t>
       </w:r>
     </w:p>
-    <w:bookmarkEnd w:id="22"/>
-    <w:bookmarkStart w:id="23" w:name="amaç-ve-hedefler"/>
+    <w:bookmarkEnd w:id="23"/>
+    <w:bookmarkStart w:id="24" w:name="amaç-ve-hedefler"/>
     <w:p>
       <w:pPr>
         <w:pStyle w:val="Heading3"/>
@@ -713,12 +730,12 @@
         <w:pStyle w:val="FirstParagraph"/>
       </w:pPr>
       <w:r>
-        <w:t xml:space="preserve">Tekrar sayısı ve koşul başına ana başarı hedefi yürütücü tarafından uygun bulunmuştur. Kesin toleranslar, süre sınırı ve ek başarı eşikleri; ölçüm düzeni, donanımın uygulanabilirliği ve danışman değerlendirmesiyle sonlandırılacaktır. Bu hedefler gelecekte yapılacak çalışmaya aittir.</w:t>
+        <w:t xml:space="preserve">Waypoint erişim toleransı, rotaya dönüş ölçütleri ve deneme süre sınırı; ölçüm düzeninin duyarlılığı, donanım özellikleri ve danışman değerlendirmesiyle başvuru öncesinde kesinleştirilecektir.</w:t>
       </w:r>
     </w:p>
-    <w:bookmarkEnd w:id="23"/>
     <w:bookmarkEnd w:id="24"/>
-    <w:bookmarkStart w:id="42" w:name="yöntem"/>
+    <w:bookmarkEnd w:id="25"/>
+    <w:bookmarkStart w:id="43" w:name="yöntem"/>
     <w:p>
       <w:pPr>
         <w:pStyle w:val="Heading2"/>
@@ -728,7 +745,7 @@
         <w:t xml:space="preserve">2. Yöntem</w:t>
       </w:r>
     </w:p>
-    <w:bookmarkStart w:id="25" w:name="araştırma-tasarımı"/>
+    <w:bookmarkStart w:id="26" w:name="araştırma-tasarımı"/>
     <w:p>
       <w:pPr>
         <w:pStyle w:val="Heading3"/>
@@ -750,11 +767,11 @@
         <w:pStyle w:val="BodyText"/>
       </w:pPr>
       <w:r>
-        <w:t xml:space="preserve">Başlangıç konumu/yönü, referans rota, zemin, hız ayarı ve kontrol parametreleri koşullar arasında aynı tutulmaya çalışılacaktır. Pil gerilimi, aydınlatma ve kontrol edilemeyen değişimler kayıt altına alınacaktır. İlk deney alanı düz zeminde yaklaşık 3 × 3 metre olarak planlanmaktadır. Alanın fiziksel yeri henüz belirlenmemiş olup şasi ve geçiş açıklıkları seçildikten sonra geometrik yeterliliği kontrol edilecektir.</w:t>
+        <w:t xml:space="preserve">Başlangıç konumu ve yönü, referans rota, zemin, hız ayarı ve kontrol parametreleri koşullar arasında sabit tutulacak; pil gerilimi, aydınlatma ve kontrol edilemeyen değişimler kaydedilecektir. Yaklaşık 3 × 3 metre olarak planlanan alanın fiziksel yeri henüz belirlenmemiştir. Alanın yeterliliği, şasi boyutları ve engel çevresindeki geçiş açıklıkları birlikte değerlendirilerek kontrol edilecektir.</w:t>
       </w:r>
     </w:p>
-    <w:bookmarkEnd w:id="25"/>
-    <w:bookmarkStart w:id="29" w:name="donanım-ve-konum-kestirimi"/>
+    <w:bookmarkEnd w:id="26"/>
+    <w:bookmarkStart w:id="30" w:name="donanım-ve-konum-kestirimi"/>
     <w:p>
       <w:pPr>
         <w:pStyle w:val="Heading3"/>
@@ -776,7 +793,7 @@
         <w:pStyle w:val="BodyText"/>
       </w:pPr>
       <w:r>
-        <w:t xml:space="preserve">Engel algılamada ön orta, iki ön çapraz ve iki yan yönünde beş sabit mesafe sensörü kullanılacaktır. Sensör modeli, montaj yüksekliği ve açıları; ölçüm aralığı, yüzey davranışı, güncelleme hızı ve kaçınmanın gerektirdiği kapsama göre seçilecektir. Sensör sayısı kesintisiz çevre taraması sağlandığı anlamına gelmez; gerçek kapsama düzenekte kontrol edilecektir. Motor, sürücü, batarya ve regülasyon bileşenleri elektriksel ve mekanik uyum birlikte değerlendirilerek belirlenecektir.</w:t>
+        <w:t xml:space="preserve">Engel algılamada ön orta, iki ön çapraz ve iki yan yönde beş sabit mesafe sensörü kullanılacaktır. Sensör modeli, montaj yüksekliği ve açıları; ölçüm aralığı, engel yüzeyine bağlı ölçüm davranışı, güncelleme hızı ve kaçınma için gerekli algılama kapsamına göre seçilecektir. Sensörlerin algıladığı bölgeler ve aralarında kalan kör alanlar gerçek düzenekte kontrol edilecektir. Motor, sürücü, batarya ve gerilim düzenleme bileşenleri elektriksel ve mekanik uyumları birlikte değerlendirilerek belirlenecektir.</w:t>
       </w:r>
     </w:p>
     <w:p>
@@ -791,18 +808,18 @@
           <wp:inline>
             <wp:extent cx="6048000" cy="4031999"/>
             <wp:effectExtent b="0" l="0" r="0" t="0"/>
-            <wp:docPr descr="Şekil 1 — Sistem mimarisi" title="" id="27" name="Picture"/>
+            <wp:docPr descr="Şekil 1 — Sistem mimarisi" title="" id="28" name="Picture"/>
             <a:graphic>
               <a:graphicData uri="http://schemas.openxmlformats.org/drawingml/2006/picture">
                 <pic:pic>
                   <pic:nvPicPr>
-                    <pic:cNvPr descr="gorseller/sekil_1_sistem_mimarisi.png" id="28" name="Picture"/>
+                    <pic:cNvPr descr="gorseller/sekil_1_sistem_mimarisi.png" id="29" name="Picture"/>
                     <pic:cNvPicPr>
                       <a:picLocks noChangeArrowheads="1" noChangeAspect="1"/>
                     </pic:cNvPicPr>
                   </pic:nvPicPr>
                   <pic:blipFill>
-                    <a:blip r:embed="rId26"/>
+                    <a:blip r:embed="rId27"/>
                     <a:stretch>
                       <a:fillRect/>
                     </a:stretch>
@@ -849,8 +866,8 @@
         <w:t xml:space="preserve">Arayüz, algılama, ESP32 ve motor sürme işlevleri arasındaki planlanan veri akışı. Simgeler temsilidir; çizim ÜYZ desteğiyle hazırlanmış tasarım şemasıdır.</w:t>
       </w:r>
     </w:p>
-    <w:bookmarkEnd w:id="29"/>
-    <w:bookmarkStart w:id="30" w:name="kullanıcı-arayüzü-ve-haberleşme"/>
+    <w:bookmarkEnd w:id="30"/>
+    <w:bookmarkStart w:id="31" w:name="kullanıcı-arayüzü-ve-haberleşme"/>
     <w:p>
       <w:pPr>
         <w:pStyle w:val="Heading3"/>
@@ -875,8 +892,8 @@
         <w:t xml:space="preserve">Rota araca yüklendikten sonra algılama ve hareket kararlarının araç üzerinde yürütülmesi planlanmaktadır. Arayüzde tahmini konum, sensör geçerlilik bilgisi ve görev durumu gösterilecektir. Bağlantı kesilmesi, sensör hatası, durdurma komutu ve ilerleyememe durumlarının davranışları uygulama öncesinde tanımlanacak ve denenecektir. Rota yüklenirken alan dışındaki noktalar ve sıfır uzunluklu ardışık parçalar reddedilecektir. Kesin arayüz teknolojisi ve ağ çalışma modu henüz seçilmemiştir.</w:t>
       </w:r>
     </w:p>
-    <w:bookmarkEnd w:id="30"/>
-    <w:bookmarkStart w:id="34" w:name="engel-kaçınma-ve-rotaya-yeniden-katılma"/>
+    <w:bookmarkEnd w:id="31"/>
+    <w:bookmarkStart w:id="35" w:name="engel-kaçınma-ve-rotaya-yeniden-katılma"/>
     <w:p>
       <w:pPr>
         <w:pStyle w:val="Heading3"/>
@@ -890,7 +907,7 @@
         <w:pStyle w:val="FirstParagraph"/>
       </w:pPr>
       <w:r>
-        <w:t xml:space="preserve">Algoritma adayı, Bug 2 yaklaşımının rota izleme, engel çevresini takip etme ve hedef doğrultusuna yeniden katılma mantığını durum makinesiyle uygulamaktır (Hauser, t.y.-a). Her iki ardışık waypoint arasında bir başlangıç–hedef doğrultusu tanımlanacaktır. Engel tespit edildiğinde araç, algılama ve durma mesafesine uygun biçimde yavaşlatılacak veya durdurulacak; temas gerçekleşmeden kaçınma durumuna geçilecektir. Yerel mesafe ölçümlerine göre engel çevresi izlenirken seçilen izleme yönü ve açıklık korunmaya çalışılacaktır.</w:t>
+        <w:t xml:space="preserve">Engelden kaçınma, Bug 2 yaklaşımının engel çevresini takip etme ve hedef doğrultusuna yeniden katılma mantığından yararlanan bir durum makinesiyle gerçekleştirilecektir (Hauser, t.y.-a). Her iki ardışık waypoint arasında bir referans rota parçası tanımlanacaktır. Engel algılandığında araç, algılama ve durma mesafesine uygun biçimde yavaşlayacak veya duracak; temas öncesinde kaçınma durumuna geçecektir. Ardından yerel mesafe ölçümlerine göre engelin kenarı izlenecek, seçilen izleme yönü ve engelle araç arasındaki açıklık korunacaktır.</w:t>
       </w:r>
     </w:p>
     <w:p>
@@ -898,7 +915,7 @@
         <w:pStyle w:val="BodyText"/>
       </w:pPr>
       <w:r>
-        <w:t xml:space="preserve">Arayüzden yüklenen waypoint sırası korunacaktır. Engel görüldüğünde etkin hedef değiştirilmeden kaçınmaya başlama konumu ve hedefe uzaklık kaydedilecektir. Araç kaçınma sırasında en yakın waypoint’e atlatılmayacak; etkin hedefe tolerans içinde erişmeden sonraki waypoint’e geçilmeyecektir. Başlangıç konumu/yönü işaretli referansa göre kurulacak ve her deneme için enkoder başlangıcı kaydedilecektir.</w:t>
+        <w:t xml:space="preserve">Arayüzden yüklenen waypoint sırası kaçınma boyunca korunacaktır. Engel algılandığında kaçınmaya başlama konumu ve etkin hedefe uzaklık kaydedilecektir. Araç, etkin hedefe tanımlanan tolerans içinde ulaşıncaya kadar aynı hedefi izleyecektir. Her denemede başlangıç konumu ve yönü işaretli referansa göre ayarlanacak, enkoder başlangıç değerleri kaydedilecektir.</w:t>
       </w:r>
     </w:p>
     <w:p>
@@ -906,7 +923,7 @@
         <w:pStyle w:val="BodyText"/>
       </w:pPr>
       <w:r>
-        <w:t xml:space="preserve">Rotaya katılma için aracın aktif</w:t>
+        <w:t xml:space="preserve">Rotaya dönüş kararı için aracın etkin</w:t>
       </w:r>
       <w:r>
         <w:t xml:space="preserve"> </w:t>
@@ -922,7 +939,7 @@
         <w:t xml:space="preserve"> </w:t>
       </w:r>
       <w:r>
-        <w:t xml:space="preserve">belirlenen tolerans içinde ulaşması, hedefe uzaklığının kaçınmaya başladığı noktaya göre ölçüm belirsizliğinden büyük bir payla azalması, engelin geride bırakılması ve gövde için ilerleme açıklığının yeterli olması birlikte değerlendirilecektir. Kaçınma boyunca seçilen kenar izleme yönü, geçiş kuralı olmadan sürekli değiştirilerek salınım oluşturmayacaktır. Rota çizgisinin bir kez kesilmesi yeterli sayılmayacak; katılma bandında kalma ve hedef yönünde ilerlemeyi sürdürme kontrol edilecektir. Kesin açıklık, süre ve ilerleme payları kalibrasyondan önce ölçülmüş değer gibi yazılmayacaktır.</w:t>
+        <w:t xml:space="preserve">tanımlanan tolerans içinde ulaşması, hedefe uzaklığının kaçınma başlangıcına göre ölçüm belirsizliğini aşan bir miktarda azalması, engelin geride kalması ve araç gövdesinin ilerleyebileceği açıklığın bulunması birlikte aranacaktır. Kenar izleme yönündeki değişiklikler önceden tanımlanmış durum geçişlerine bağlanacaktır. Rotaya dönüş, yalnızca rota çizgisinin kesilmesiyle değil, aracın belirlenen bant içinde kalarak hedefe doğru ilerlemesini sürdürmesiyle doğrulanacaktır. Açıklık, süre ve ilerleme eşikleri ölçüm duyarlılığı ve kalibrasyon sonuçlarıyla gerekçelendirilecektir.</w:t>
       </w:r>
     </w:p>
     <w:p>
@@ -930,25 +947,7 @@
         <w:pStyle w:val="BodyText"/>
       </w:pPr>
       <w:r>
-        <w:t xml:space="preserve">Bu uygulama, Bug 2 mantığından yararlanan gerçek araç uyarlamasıdır; ideal algoritmanın eksiksiz uygulandığı veya teorik tamlık garantisinin sağlandığı iddia edilmeyecektir. Aynı bölgede ilerleyememe, döngü şüphesi, geçersiz sensör verisi, alan sınırına yaklaşma veya süre sınırının aşılması durumlarında deneme durdurulup nedeni kaydedilecektir. Durdurma kaydı</w:t>
-      </w:r>
-      <w:r>
-        <w:t xml:space="preserve"> </w:t>
-      </w:r>
-      <w:r>
-        <w:t xml:space="preserve">“</w:t>
-      </w:r>
-      <w:r>
-        <w:t xml:space="preserve">bu düzenekte tamamlanamadı</w:t>
-      </w:r>
-      <w:r>
-        <w:t xml:space="preserve">”</w:t>
-      </w:r>
-      <w:r>
-        <w:t xml:space="preserve"> </w:t>
-      </w:r>
-      <w:r>
-        <w:t xml:space="preserve">anlamındadır; ortamda hiçbir geçerli yol bulunmadığının kanıtı sayılmayacaktır. Gerçek aracın genişliği, dönüş kabiliyeti, kısıtlı sensör kapsaması ve konum hatası tasarımda dikkate alınacaktır.</w:t>
+        <w:t xml:space="preserve">Bug 2 yaklaşımı; araç genişliği, dönüş kabiliyeti, sınırlı sensör kapsaması ve konum hatası dikkate alınarak fiziksel düzeneğe uyarlanacaktır. Bu nedenle ideal algoritmaya ait teorik tamlık özellikleri prototip için garanti edilmeyecektir. Aynı bölgede ilerleyememe, döngü şüphesi, geçersiz sensör verisi, alan sınırına yaklaşma veya süre aşımı durumunda deneme durdurulacak ve neden kaydedilecektir. Bu kayıt, görevin ilgili düzenekte tamamlanamadığını gösterecektir; ortamda geçerli bir yol bulunmadığı sonucuna dayanak oluşturmayacaktır.</w:t>
       </w:r>
     </w:p>
     <w:p>
@@ -963,18 +962,18 @@
           <wp:inline>
             <wp:extent cx="5070608" cy="6336000"/>
             <wp:effectExtent b="0" l="0" r="0" t="0"/>
-            <wp:docPr descr="Şekil 2 — Kontrol akışı" title="" id="32" name="Picture"/>
+            <wp:docPr descr="Şekil 2 — Kontrol akışı" title="" id="33" name="Picture"/>
             <a:graphic>
               <a:graphicData uri="http://schemas.openxmlformats.org/drawingml/2006/picture">
                 <pic:pic>
                   <pic:nvPicPr>
-                    <pic:cNvPr descr="gorseller/sekil_2_calisma_akisi.png" id="33" name="Picture"/>
+                    <pic:cNvPr descr="gorseller/sekil_2_calisma_akisi.png" id="34" name="Picture"/>
                     <pic:cNvPicPr>
                       <a:picLocks noChangeArrowheads="1" noChangeAspect="1"/>
                     </pic:cNvPicPr>
                   </pic:nvPicPr>
                   <pic:blipFill>
-                    <a:blip r:embed="rId31"/>
+                    <a:blip r:embed="rId32"/>
                     <a:stretch>
                       <a:fillRect/>
                     </a:stretch>
@@ -1039,8 +1038,8 @@
         <w:t xml:space="preserve">bağlantıları yeni kontrol döngüsüne dönüşü gösterir. Çizim ÜYZ desteğiyle hazırlanmıştır.</w:t>
       </w:r>
     </w:p>
-    <w:bookmarkEnd w:id="34"/>
-    <w:bookmarkStart w:id="38" w:name="deney-koşulları-ve-tekrarlar"/>
+    <w:bookmarkEnd w:id="35"/>
+    <w:bookmarkStart w:id="39" w:name="deney-koşulları-ve-tekrarlar"/>
     <w:p>
       <w:pPr>
         <w:pStyle w:val="Heading3"/>
@@ -1394,7 +1393,7 @@
         <w:pStyle w:val="BodyText"/>
       </w:pPr>
       <w:r>
-        <w:t xml:space="preserve">Toplam 40 geçerli değerlendirme denemesi yapılacaktır. Koşulların 10 blokta uygulanması, her blokta dört koşulun birer kez ve önceden rastgeleleştirilmiş sırayla yürütülmesi önerilmektedir. Böylece koşulların yalnızca pilin belirli bir durumuna veya tek bir uygulama sırasına denk gelmesi azaltılacaktır. Nihai rota, engel koordinatları ve geçiş açıklıkları araç geometrisiyle birlikte sonlandırılacaktır. L biçimli 3 metre rota, mevcut protokolde başlangıç önerisidir.</w:t>
+        <w:t xml:space="preserve">Toplam 40 geçerli değerlendirme denemesi yapılacaktır. Uygulama sırası ve pil durumunun etkisini azaltmak amacıyla, her koşulun bir kez yer aldığı 10 blok ve blok içinde önceden rastgeleleştirilmiş sıra kullanılması önerilmektedir. Nihai rota, engel koordinatları ve geçiş açıklıkları araç geometrisine göre başvuru öncesinde kesinleştirilecektir.</w:t>
       </w:r>
     </w:p>
     <w:p>
@@ -1409,18 +1408,18 @@
           <wp:inline>
             <wp:extent cx="6048000" cy="4031999"/>
             <wp:effectExtent b="0" l="0" r="0" t="0"/>
-            <wp:docPr descr="Şekil 3 — Deney düzeni" title="" id="36" name="Picture"/>
+            <wp:docPr descr="Şekil 3 — Deney düzeni" title="" id="37" name="Picture"/>
             <a:graphic>
               <a:graphicData uri="http://schemas.openxmlformats.org/drawingml/2006/picture">
                 <pic:pic>
                   <pic:nvPicPr>
-                    <pic:cNvPr descr="gorseller/sekil_3_deney_alani.png" id="37" name="Picture"/>
+                    <pic:cNvPr descr="gorseller/sekil_3_deney_alani.png" id="38" name="Picture"/>
                     <pic:cNvPicPr>
                       <a:picLocks noChangeArrowheads="1" noChangeAspect="1"/>
                     </pic:cNvPicPr>
                   </pic:nvPicPr>
                   <pic:blipFill>
-                    <a:blip r:embed="rId35"/>
+                    <a:blip r:embed="rId36"/>
                     <a:stretch>
                       <a:fillRect/>
                     </a:stretch>
@@ -1467,8 +1466,8 @@
         <w:t xml:space="preserve">Planlanan yaklaşık 3 × 3 metre alanda örnek rota ve kaçınma davranışının temsili gösterimi. Şekil nihai engel koordinatlarını veya ölçülmüş yolu göstermez; kaçınma eğrisi deney/simülasyon verisi değildir. Çizim ÜYZ desteğiyle hazırlanmıştır.</w:t>
       </w:r>
     </w:p>
-    <w:bookmarkEnd w:id="38"/>
-    <w:bookmarkStart w:id="39" w:name="bağımsız-ölçüm-ve-başarı-tanımı"/>
+    <w:bookmarkEnd w:id="39"/>
+    <w:bookmarkStart w:id="40" w:name="bağımsız-ölçüm-ve-başarı-tanımı"/>
     <w:p>
       <w:pPr>
         <w:pStyle w:val="Heading3"/>
@@ -1482,7 +1481,7 @@
         <w:pStyle w:val="FirstParagraph"/>
       </w:pPr>
       <w:r>
-        <w:t xml:space="preserve">Aracın hareketi, mevcut telefonla sabit görüntü kaydı üzerinden bağımsız olarak değerlendirilecektir. Bu düzenek henüz kurulmamıştır; tüm alanın görülmesi, sabitleme, görüntü–metre dönüşümü, lens bozulması ve izleme işaretinin yüksekliğine bağlı perspektif hatası kontrol edilecektir. Kalibrasyonda kullanılmayan kontrol noktalarıyla ölçüm doğruluğu değerlendirilecektir. Güvenilir referansla kalibrasyon gereksinimi, Hauser’in (t.y.-b) yaklaşımıyla uyumludur. Rota hatası aracın kendi konum tahmininin yine kendisiyle karşılaştırılmasıyla doğrulanmayacaktır.</w:t>
+        <w:t xml:space="preserve">Aracın hareketi, yürütücünün mevcut telefonuyla alınacak sabit görüntü kaydı üzerinden bağımsız olarak değerlendirilecektir. Kurulacak ölçüm düzeninde tüm alanın görüntülenmesi, kameranın sabitlenmesi, görüntü koordinatlarının metreye dönüştürülmesi, mercek bozulması ve araç üzerindeki izleme işaretinin yüksekliğine bağlı perspektif hatası kontrol edilecektir. Ölçüm doğruluğu, kalibrasyonda kullanılmayan kontrol noktalarıyla değerlendirilecektir. Bu yaklaşım, ölçümlerin güvenilir referanslarla ilişkilendirilmesine dayanan kalibrasyon çerçevesiyle uyumludur (Hauser, t.y.-b). Rota hatası, araç içi konum tahmininden bağımsız olarak hesaplanacaktır.</w:t>
       </w:r>
     </w:p>
     <w:p>
@@ -1498,11 +1497,11 @@
         <w:pStyle w:val="BodyText"/>
       </w:pPr>
       <w:r>
-        <w:t xml:space="preserve">Waypoint toleransı, rotaya dönüş bandı ve süre sınırı, ölçüm duyarlılığı ve donanım davranışıyla gerekçelendirilecektir. Mevcut çalışma notlarındaki 10 cm bant ve 120 saniye sınırı henüz seçilmiş değerler değildir. Bu değerler ile ek hedefler başvuru metni sonlandırılmadan önce değerlendirilecektir.</w:t>
+        <w:t xml:space="preserve">Waypoint erişimi ve rotaya dönüş için kullanılacak toleranslar ile deneme süre sınırı, ölçüm duyarlılığı ve donanım özellikleriyle gerekçelendirilecektir. Başvuruda kullanılacak sayısal değerler, ölçüm düzeninin uygulanabilirliği ve danışman değerlendirmesiyle kesinleştirilecektir.</w:t>
       </w:r>
     </w:p>
-    <w:bookmarkEnd w:id="39"/>
-    <w:bookmarkStart w:id="40" w:name="veri-analizi-ve-başarısız-denemeler"/>
+    <w:bookmarkEnd w:id="40"/>
+    <w:bookmarkStart w:id="41" w:name="veri-analizi-ve-başarısız-denemeler"/>
     <w:p>
       <w:pPr>
         <w:pStyle w:val="Heading3"/>
@@ -1516,7 +1515,7 @@
         <w:pStyle w:val="FirstParagraph"/>
       </w:pPr>
       <w:r>
-        <w:t xml:space="preserve">Her koşul için başarı oranları, ilgili aşamada başarılı deneme sayısının o koşuldaki tüm geçerli denemelere bölünmesiyle hesaplanacaktır. Birleşik görev hedefi her engelli koşul için ayrı aranacak; yalnız toplam engelli başarı oranının yeterli görünmesi, bir koşuldaki yetersizliği gizlemeyecektir. Engelsiz koşulda yanlış engel uyarıları ayrıca sayılacaktır.</w:t>
+        <w:t xml:space="preserve">Her koşulda algılama, kaçınma, rotaya dönüş ve görev tamamlama oranları ayrı ayrı hesaplanacaktır. Her oranın paydasını ilgili koşuldaki tüm geçerli denemeler oluşturacaktır. Ana başarı hedefi, tüm aşamaların birlikte tamamlandığı deneme sayısına göre her engelli koşul için ayrı değerlendirilecektir. Engelsiz koşulda yanlış engel uyarıları da kaydedilecektir.</w:t>
       </w:r>
     </w:p>
     <w:p>
@@ -1532,7 +1531,7 @@
         <w:pStyle w:val="BodyText"/>
       </w:pPr>
       <w:r>
-        <w:t xml:space="preserve">Çarpışma, kontrol kesintisi, ilerleyememe ve süre aşımı gibi geçerli başarısızlıklar paydada tutulacaktır. Yalnızca önceden tanımlanmış, araç davranışından bağımsız kayıt/düzenek hataları nedeniyle değerlendirilemeyen denemeler gerekçeleriyle ayrılabilecektir. Yazılım veya donanım değişirse sürüm ve neden kaydedilecek; karşılaştırılan koşullar aynı son sürümle değerlendirilecektir. Bu tekrar planından bütün kullanım ortamlarına başarı veya istatistiksel anlamlılık sonucu çıkarılmayacaktır.</w:t>
+        <w:t xml:space="preserve">Çarpışma, kontrol kesintisi, ilerleyememe ve süre aşımı değerlendirmeye başarısız deneme olarak dahil edilecektir. Yalnızca önceden tanımlanmış, araç davranışından bağımsız kayıt veya düzenek hataları nedeniyle değerlendirilemeyen denemeler gerekçeleriyle ayrılabilecektir. Yazılım veya donanım değişiklikleri sürüm ve nedenleriyle kaydedilecek; karşılaştırılan koşullar aynı son sürümle değerlendirilecektir. Bulgular, seçilen deney koşulları ve tekrar sayısının sınırları içinde yorumlanacaktır.</w:t>
       </w:r>
     </w:p>
     <w:p>
@@ -1540,7 +1539,7 @@
         <w:pStyle w:val="BodyText"/>
       </w:pPr>
       <w:r>
-        <w:t xml:space="preserve">Bağımsız değerlendirmede aktif rota parçası, waypoint’lere sıralı erişimin görüntüden doğrulanmasına göre belirlenecektir. Ölçülen araç referans noktasının bu sonlu parçadaki en yakın noktaya uzaklığı rota hatası olarak alınacaktır; parçanın sonsuz uzantısına uzaklık yeterli sayılmayacaktır. Geçerli ve eşit zaman aralığına getirilmiş izleme örneklerinde kök ortalama karesel hata (RMSE) hesaplanacaktır:</w:t>
+        <w:t xml:space="preserve">Bağımsız değerlendirmede etkin rota parçası, waypoint’lere sıralı erişimin görüntüden doğrulanmasına göre belirlenecektir. Araç üzerindeki referans noktasının bu sonlu parçadaki en yakın noktaya uzaklığı rota hatası olarak alınacaktır. Geçerli izleme verilerinden eşit zaman aralıklarıyla oluşturulan konum örnekleri için kök ortalama karesel hata (RMSE) hesaplanacaktır:</w:t>
       </w:r>
     </w:p>
     <w:p>
@@ -1661,10 +1660,7 @@
         </m:sSub>
       </m:oMath>
       <w:r>
-        <w:t xml:space="preserve"> </w:t>
-      </w:r>
-      <w:r>
-        <w:t xml:space="preserve">bağımsız ölçülen konumun referans parçaya uzaklığı,</w:t>
+        <w:t xml:space="preserve">, bağımsız ölçülen konumun referans rota parçasına uzaklığını;</w:t>
       </w:r>
       <w:r>
         <w:t xml:space="preserve"> </w:t>
@@ -1675,14 +1671,11 @@
         </m:r>
       </m:oMath>
       <w:r>
-        <w:t xml:space="preserve"> </w:t>
-      </w:r>
-      <w:r>
-        <w:t xml:space="preserve">değerlendirilen konum örneği sayısıdır. Örnekleme aralığı ve veri kapsamı raporlanacak; kayıp görüntü aralıkları sonuç iyileştirmek için doldurulmayacaktır. Temas ve algılama olaylarının sırası zaman eşleme belirsizliği nedeniyle ayırt edilemiyorsa olay başarılı algılama diye işaretlenmeyecektir.</w:t>
+        <w:t xml:space="preserve">, değerlendirilen konum örneği sayısını göstermektedir. Örnekleme aralığı ve geçerli verinin kapsadığı süre raporlanacak; görüntü kaybı olan aralıklar hesaplamadan ayrı tutulacaktır. Temas ve algılama sırası, zaman eşleme belirsizliği nedeniyle ayırt edilemiyorsa ilgili olay temas öncesi başarılı algılama olarak sınıflandırılmayacaktır.</w:t>
       </w:r>
     </w:p>
-    <w:bookmarkEnd w:id="40"/>
-    <w:bookmarkStart w:id="41" w:name="ön-hazırlık-durumu"/>
+    <w:bookmarkEnd w:id="41"/>
+    <w:bookmarkStart w:id="42" w:name="ön-hazırlık-durumu"/>
     <w:p>
       <w:pPr>
         <w:pStyle w:val="Heading3"/>
@@ -1699,9 +1692,9 @@
         <w:t xml:space="preserve">Başvuru hazırlığında güncel program belgeleri, ilgili yayınlar ve teknik dokümanlar incelenmiş; mimari, deney protokolü, kaynaklı malzeme adayları ve tasarım şemaları hazırlanmıştır. Fiziksel prototip üretilmemiş, sensör/motor kalibrasyonu veya performans deneyi yapılmamıştır. Dolayısıyla araç için elde edilmiş doğruluk, başarı oranı veya çalışma süresi bildirilmemektedir.</w:t>
       </w:r>
     </w:p>
-    <w:bookmarkEnd w:id="41"/>
     <w:bookmarkEnd w:id="42"/>
-    <w:bookmarkStart w:id="46" w:name="proje-yönetimi"/>
+    <w:bookmarkEnd w:id="43"/>
+    <w:bookmarkStart w:id="47" w:name="proje-yönetimi"/>
     <w:p>
       <w:pPr>
         <w:pStyle w:val="Heading2"/>
@@ -1711,7 +1704,7 @@
         <w:t xml:space="preserve">3. Proje yönetimi</w:t>
       </w:r>
     </w:p>
-    <w:bookmarkStart w:id="43" w:name="çalışma-takvimi"/>
+    <w:bookmarkStart w:id="44" w:name="çalışma-takvimi"/>
     <w:p>
       <w:pPr>
         <w:pStyle w:val="Heading3"/>
@@ -2257,11 +2250,11 @@
         <w:pStyle w:val="BodyText"/>
       </w:pPr>
       <w:r>
-        <w:t xml:space="preserve">Katkı değerleri toplamı %100’dür; bunlar deney başarı yüzdeleri değildir. Donanım erişimi beklenirken arayüz ve yazılım hazırlığı öne alınabilecektir. Mayıs içinde deney/analiz, Haziran içinde danışman incelemesi ve bitirme teslimi hedeflenmektedir. Literatür incelemesi, malzeme alımı ve rapor hazırlığı ayrı iş paketi olarak gösterilmemiştir. Haziran teslim günü henüz belli değildir.</w:t>
+        <w:t xml:space="preserve">İş paketlerinin başarıya katkıları toplamı %100’dür. Donanıma erişim beklenirken arayüz ve yazılım hazırlığı öne alınabilecektir. Deney ve analizlerin Mayıs ayında, danışman incelemesi ve bitirme tesliminin Haziran ayında tamamlanması hedeflenmektedir. Kesin teslim günü henüz belirlenmemiştir.</w:t>
       </w:r>
     </w:p>
-    <w:bookmarkEnd w:id="43"/>
-    <w:bookmarkStart w:id="44" w:name="risk-yönetimi"/>
+    <w:bookmarkEnd w:id="44"/>
+    <w:bookmarkStart w:id="45" w:name="risk-yönetimi"/>
     <w:p>
       <w:pPr>
         <w:pStyle w:val="Heading3"/>
@@ -2867,11 +2860,11 @@
         <w:pStyle w:val="BodyText"/>
       </w:pPr>
       <w:r>
-        <w:t xml:space="preserve">Hata nedeniyle durdurulan bir deneme başarılı kaçınma sayılmayacaktır. B planları, otonom kaçınma ve rotaya dönüşü elle yönlendirme veya yalnızca durmayla değiştirmeyecektir.</w:t>
+        <w:t xml:space="preserve">B planlarının uygulanmasında engeli algılama, otonom kaçınma ve rotaya dönüş işlevleri korunacaktır. Hata nedeniyle durdurulan veya elle yönlendirme gerektiren denemeler başarılı otonom görev olarak değerlendirilmeyecektir.</w:t>
       </w:r>
     </w:p>
-    <w:bookmarkEnd w:id="44"/>
-    <w:bookmarkStart w:id="45" w:name="araştırma-olanakları"/>
+    <w:bookmarkEnd w:id="45"/>
+    <w:bookmarkStart w:id="46" w:name="araştırma-olanakları"/>
     <w:p>
       <w:pPr>
         <w:pStyle w:val="Heading3"/>
@@ -3104,9 +3097,9 @@
         <w:t xml:space="preserve">Mevcut telefon ve lehim ekipmanı için yeniden alım planlanmamaktadır. Multimetre, uzunluk ölçümü, şasi imalatı ve telefon sabitleme olanakları ayrıca doğrulanacaktır. Planlanan ESP32, motor ve sensörler mevcut kurum ekipmanı gibi gösterilmeyecektir.</w:t>
       </w:r>
     </w:p>
-    <w:bookmarkEnd w:id="45"/>
     <w:bookmarkEnd w:id="46"/>
-    <w:bookmarkStart w:id="47" w:name="araştırma-önerisinin-yaygın-etkisi"/>
+    <w:bookmarkEnd w:id="47"/>
+    <w:bookmarkStart w:id="48" w:name="araştırma-önerisinin-yaygın-etkisi"/>
     <w:p>
       <w:pPr>
         <w:pStyle w:val="Heading2"/>
@@ -3464,8 +3457,8 @@
         <w:t xml:space="preserve">Yürütücünün gömülü sistem, arayüz geliştirme, sensör kalibrasyonu ve deneysel analiz becerilerini geliştirmesi beklenmektedir. Paylaşılabilir teknik çıktılar aynı GitHub deposunda düzenlenecektir. Yayın veya bilimsel sunum olanağı, elde edilecek bulguların niteliği ve danışman değerlendirmesine göre ele alınacaktır.</w:t>
       </w:r>
     </w:p>
-    <w:bookmarkEnd w:id="47"/>
-    <w:bookmarkStart w:id="48" w:name="belirtmek-istenen-diğer-konular"/>
+    <w:bookmarkEnd w:id="48"/>
+    <w:bookmarkStart w:id="49" w:name="belirtmek-istenen-diğer-konular"/>
     <w:p>
       <w:pPr>
         <w:pStyle w:val="Heading2"/>
@@ -3479,11 +3472,11 @@
         <w:pStyle w:val="FirstParagraph"/>
       </w:pPr>
       <w:r>
-        <w:t xml:space="preserve">Projenin ilk kapsamı düz zemindeki sabit engellerle sınırlandırılmıştır. Hareketli engeller, gerçek coğrafi harita, farklı zemin türleri ve her ortamda doğrulanmış çalışma bu deney planının hedefi değildir. Önceki yıllara ait örnek başvurular anlatım/yerleşim açısından incelenmiş; metinleri, sonuçları veya kişisel bilgileri bu öneriye aktarılmamıştır.</w:t>
+        <w:t xml:space="preserve">Deneylerden elde edilecek sonuçlar, düz zeminde ve seçilen sabit engel yerleşimlerinde gözlenen davranışları açıklamak için kullanılacaktır. Hareketli engeller, gerçek coğrafi harita tabanlı kullanım ve farklı zemin türleri ileride değerlendirilebilecek geliştirme alanlarıdır; bu araştırmanın deney kapsamına dahil edilmemiştir.</w:t>
       </w:r>
     </w:p>
-    <w:bookmarkEnd w:id="48"/>
-    <w:bookmarkStart w:id="49" w:name="ekler"/>
+    <w:bookmarkEnd w:id="49"/>
+    <w:bookmarkStart w:id="50" w:name="ekler"/>
     <w:p>
       <w:pPr>
         <w:pStyle w:val="Heading2"/>
@@ -3497,11 +3490,11 @@
         <w:pStyle w:val="FirstParagraph"/>
       </w:pPr>
       <w:r>
-        <w:t xml:space="preserve">Bu taslakta ayrı ölçek veya anket eki bulunmamaktadır. Üç tasarım şeması ilgili yöntem bölümlerinde yer almaktadır. Ayrıntılı deney protokolü, boş kayıt şablonu ve malzeme/fiyat kayıtları hazırlık dosyalarında tutulmaktadır; bunlar yapılmış deney sonucu değildir.</w:t>
+        <w:t xml:space="preserve">Sistem mimarisi, kontrol akışı ve deney alanına ilişkin üç tasarım şeması yöntem bölümünde sunulmuştur. Araştırmada ölçek veya anket kullanılması planlanmamaktadır.</w:t>
       </w:r>
     </w:p>
-    <w:bookmarkEnd w:id="49"/>
-    <w:bookmarkStart w:id="57" w:name="kaynakça"/>
+    <w:bookmarkEnd w:id="50"/>
+    <w:bookmarkStart w:id="58" w:name="kaynakça"/>
     <w:p>
       <w:pPr>
         <w:pStyle w:val="Heading2"/>
@@ -3552,7 +3545,7 @@
       <w:r>
         <w:t xml:space="preserve"> </w:t>
       </w:r>
-      <w:hyperlink r:id="rId50">
+      <w:hyperlink r:id="rId51">
         <w:r>
           <w:rPr>
             <w:rStyle w:val="Hyperlink"/>
@@ -3605,7 +3598,7 @@
       <w:r>
         <w:t xml:space="preserve"> </w:t>
       </w:r>
-      <w:hyperlink r:id="rId51">
+      <w:hyperlink r:id="rId52">
         <w:r>
           <w:rPr>
             <w:rStyle w:val="Hyperlink"/>
@@ -3658,7 +3651,7 @@
       <w:r>
         <w:t xml:space="preserve"> </w:t>
       </w:r>
-      <w:hyperlink r:id="rId52">
+      <w:hyperlink r:id="rId53">
         <w:r>
           <w:rPr>
             <w:rStyle w:val="Hyperlink"/>
@@ -3711,7 +3704,7 @@
       <w:r>
         <w:t xml:space="preserve"> </w:t>
       </w:r>
-      <w:hyperlink r:id="rId53">
+      <w:hyperlink r:id="rId54">
         <w:r>
           <w:rPr>
             <w:rStyle w:val="Hyperlink"/>
@@ -3764,7 +3757,7 @@
       <w:r>
         <w:t xml:space="preserve"> </w:t>
       </w:r>
-      <w:hyperlink r:id="rId54">
+      <w:hyperlink r:id="rId55">
         <w:r>
           <w:rPr>
             <w:rStyle w:val="Hyperlink"/>
@@ -3817,7 +3810,7 @@
       <w:r>
         <w:t xml:space="preserve"> </w:t>
       </w:r>
-      <w:hyperlink r:id="rId55">
+      <w:hyperlink r:id="rId56">
         <w:r>
           <w:rPr>
             <w:rStyle w:val="Hyperlink"/>
@@ -3870,7 +3863,7 @@
       <w:r>
         <w:t xml:space="preserve"> </w:t>
       </w:r>
-      <w:hyperlink r:id="rId56">
+      <w:hyperlink r:id="rId57">
         <w:r>
           <w:rPr>
             <w:rStyle w:val="Hyperlink"/>
@@ -3880,123 +3873,6 @@
       </w:hyperlink>
       <w:r>
         <w:t xml:space="preserve">.</w:t>
-      </w:r>
-    </w:p>
-    <w:bookmarkEnd w:id="57"/>
-    <w:bookmarkStart w:id="58" w:name="Xf464aa70f1a7e1b641d77641e8e8c98cdbde733"/>
-    <w:p>
-      <w:pPr>
-        <w:pStyle w:val="Heading2"/>
-        <w:pageBreakBefore/>
-      </w:pPr>
-      <w:r>
-        <w:t xml:space="preserve">Son düzenlemede tamamlanacak alanlar — hazırlık notu</w:t>
-      </w:r>
-    </w:p>
-    <w:p>
-      <w:pPr>
-        <w:pStyle w:val="FirstParagraph"/>
-      </w:pPr>
-      <w:r>
-        <w:t xml:space="preserve">Bu bölüm çalışma takibi içindir; başvuru metninin bilimsel bölümüne aynen aktarılmayacaktır.</w:t>
-      </w:r>
-    </w:p>
-    <w:p>
-      <w:pPr>
-        <w:pStyle w:val="Compact"/>
-        <w:numPr>
-          <w:ilvl w:val="0"/>
-          <w:numId w:val="1003"/>
-        </w:numPr>
-      </w:pPr>
-      <w:r>
-        <w:t xml:space="preserve">Son proje başlığı ve danışmanın metin değerlendirmesi.</w:t>
-      </w:r>
-    </w:p>
-    <w:p>
-      <w:pPr>
-        <w:pStyle w:val="Compact"/>
-        <w:numPr>
-          <w:ilvl w:val="0"/>
-          <w:numId w:val="1003"/>
-        </w:numPr>
-      </w:pPr>
-      <w:r>
-        <w:t xml:space="preserve">Resmî proje süresi ve TYBS’ye uygun ay aralıkları; Haziran bitirme hedefiyle uyumu.</w:t>
-      </w:r>
-    </w:p>
-    <w:p>
-      <w:pPr>
-        <w:pStyle w:val="Compact"/>
-        <w:numPr>
-          <w:ilvl w:val="0"/>
-          <w:numId w:val="1003"/>
-        </w:numPr>
-      </w:pPr>
-      <w:r>
-        <w:t xml:space="preserve">Deney yerinin seçimi ve gerçekten kullanılacak kurum olanakları.</w:t>
-      </w:r>
-    </w:p>
-    <w:p>
-      <w:pPr>
-        <w:pStyle w:val="Compact"/>
-        <w:numPr>
-          <w:ilvl w:val="0"/>
-          <w:numId w:val="1003"/>
-        </w:numPr>
-      </w:pPr>
-      <w:r>
-        <w:t xml:space="preserve">Algoritma/ürün seçimleri, bağımsız ölçüm uygulanabilirliği ve kalan sayısal toleranslar.</w:t>
-      </w:r>
-    </w:p>
-    <w:p>
-      <w:pPr>
-        <w:pStyle w:val="Compact"/>
-        <w:numPr>
-          <w:ilvl w:val="0"/>
-          <w:numId w:val="1003"/>
-        </w:numPr>
-      </w:pPr>
-      <w:r>
-        <w:t xml:space="preserve">Türkiye teslim giderleri ve eksik kalemlerle tamamlanmış nihai TL bütçesi. Mevcut kaynaklı referans hesabı 11.986,24 TL’dir; şasi ve diğer eksikler dahil değildir, talep edilecek bütçe olarak yazılmamıştır.</w:t>
-      </w:r>
-    </w:p>
-    <w:p>
-      <w:pPr>
-        <w:pStyle w:val="Compact"/>
-        <w:numPr>
-          <w:ilvl w:val="0"/>
-          <w:numId w:val="1003"/>
-        </w:numPr>
-      </w:pPr>
-      <w:r>
-        <w:t xml:space="preserve">Özetin son metinle uyumu, atıflar, görsel etiketleri ve TYBS önizleme kontrolü.</w:t>
-      </w:r>
-    </w:p>
-    <w:p>
-      <w:pPr>
-        <w:pStyle w:val="FirstParagraph"/>
-      </w:pPr>
-      <w:r>
-        <w:t xml:space="preserve">2026 başvurusu TYBS alanlarına girilen bilgilerle oluşturulmaktadır. Bu belgenin PDF/Word sürümü birlikte inceleme içindir; ayrı bir araştırma önerisi PDF’si yükleme şartı olarak sunulmamaktadır.</w:t>
-      </w:r>
-    </w:p>
-    <w:p>
-      <w:pPr>
-        <w:pStyle w:val="BodyText"/>
-      </w:pPr>
-      <w:r>
-        <w:rPr>
-          <w:b/>
-          <w:bCs/>
-        </w:rPr>
-        <w:t xml:space="preserve">ÜYZ beyanı için hazırlık kaydı:</w:t>
-      </w:r>
-      <w:r>
-        <w:t xml:space="preserve"> </w:t>
-      </w:r>
-      <w:r>
-        <w:t xml:space="preserve">ChatGPT/Codex; kaynak inceleme desteği, taslakların hazırlanması/düzenlenmesi ve belge oluşturma için; image_gen üç tasarım şemasının üretilmesi için kullanılmıştır. Araç sürümü görünmüyorsa tahmin edilmeyecektir. Başvuru sistemindeki beyan alanı gerçek kullanım kapsamıyla doldurulacak; içerik yürütücü ve danışman tarafından kontrol edilecektir.</w:t>
       </w:r>
     </w:p>
     <w:bookmarkEnd w:id="58"/>
@@ -4542,9 +4418,6 @@
     </w:lvlOverride>
   </w:num>
   <w:num w:numId="1002">
-    <w:abstractNumId w:val="991"/>
-  </w:num>
-  <w:num w:numId="1003">
     <w:abstractNumId w:val="991"/>
   </w:num>
 </w:numbering>

</xml_diff>

<commit_message>
ToF önceliğini yönteme işle ve stok ile başvuru şartını ayır
</commit_message>
<xml_diff>
--- a/docs/2209-A/ARASTIRMA_ONERISI_BIRLESIK_TASLAK.docx
+++ b/docs/2209-A/ARASTIRMA_ONERISI_BIRLESIK_TASLAK.docx
@@ -20,7 +20,7 @@
           <w:b/>
           <w:bCs/>
         </w:rPr>
-        <w:t xml:space="preserve">Birleşik metin taslağı · 22 Ekim 2026 · Dil ve anlatım düzenlemesi</w:t>
+        <w:t xml:space="preserve">Birleşik metin taslağı · 22 Ekim 2026 · ToF önceliği güncellemesi</w:t>
       </w:r>
     </w:p>
     <w:p>
@@ -793,7 +793,7 @@
         <w:pStyle w:val="BodyText"/>
       </w:pPr>
       <w:r>
-        <w:t xml:space="preserve">Engel algılamada ön orta, iki ön çapraz ve iki yan yönde beş sabit mesafe sensörü kullanılacaktır. Sensör modeli, montaj yüksekliği ve açıları; ölçüm aralığı, engel yüzeyine bağlı ölçüm davranışı, güncelleme hızı ve kaçınma için gerekli algılama kapsamına göre seçilecektir. Sensörlerin algıladığı bölgeler ve aralarında kalan kör alanlar gerçek düzenekte kontrol edilecektir. Motor, sürücü, batarya ve gerilim düzenleme bileşenleri elektriksel ve mekanik uyumları birlikte değerlendirilerek belirlenecektir.</w:t>
+        <w:t xml:space="preserve">Engel algılamada ön orta, iki ön çapraz ve iki yan yönde beş sabit mesafe sensörü kullanılacaktır. Mesafe sensörü seçiminde uçuş süresi (ToF) tabanlı taşıyıcılar önceliklendirilecektir. Kesin taşıyıcı modeli, montaj yüksekliği ve açıları; ölçüm aralığı, engel yüzeyine bağlı ölçüm davranışı, güncelleme hızı ve kaçınma için gerekli algılama kapsamına göre seçilecektir. Sensörlerin algıladığı bölgeler ve aralarında kalan kör alanlar gerçek düzenekte kontrol edilecektir. Motor, sürücü, batarya ve gerilim düzenleme bileşenleri elektriksel ve mekanik uyumları birlikte değerlendirilerek belirlenecektir.</w:t>
       </w:r>
     </w:p>
     <w:p>
@@ -2811,7 +2811,7 @@
               <w:rPr>
                 <w:sz w:val="19"/>
               </w:rPr>
-              <w:t xml:space="preserve">Kaynaklı fiyat, stok ve teknik uyumu birlikte incelemek.</w:t>
+              <w:t xml:space="preserve">Tarihli fiyatları, teknik uyumu ve öngörülen temin süresini birlikte incelemek.</w:t>
             </w:r>
           </w:p>
         </w:tc>

</xml_diff>

<commit_message>
Kullanıcının seçtiği ilk proje başlığını rapora uygula
</commit_message>
<xml_diff>
--- a/docs/2209-A/ARASTIRMA_ONERISI_BIRLESIK_TASLAK.docx
+++ b/docs/2209-A/ARASTIRMA_ONERISI_BIRLESIK_TASLAK.docx
@@ -20,7 +20,7 @@
           <w:b/>
           <w:bCs/>
         </w:rPr>
-        <w:t xml:space="preserve">Birleşik metin taslağı · 22 Ekim 2026 · ToF önceliği güncellemesi</w:t>
+        <w:t xml:space="preserve">Birleşik metin taslağı · 22 Ekim 2026 · Proje başlığı güncellemesi</w:t>
       </w:r>
     </w:p>
     <w:p>
@@ -32,13 +32,13 @@
           <w:b/>
           <w:bCs/>
         </w:rPr>
-        <w:t xml:space="preserve">Proje adı önerisi:</w:t>
+        <w:t xml:space="preserve">Proje adı:</w:t>
       </w:r>
       <w:r>
         <w:t xml:space="preserve"> </w:t>
       </w:r>
       <w:r>
-        <w:t xml:space="preserve">Kullanıcı Tanımlı Rota Takibi ve Engelden Kaçınma Özellikli Otonom Kara Aracının Geliştirilmesi</w:t>
+        <w:t xml:space="preserve">Kullanıcı tarafından belirlenen rota bilgisine göre hareket eden otonom araç tasarımı</w:t>
       </w:r>
     </w:p>
     <w:p>

</xml_diff>

<commit_message>
Kullanıcının seçtiği altı aylık planı rapora ve takvime işle
</commit_message>
<xml_diff>
--- a/docs/2209-A/ARASTIRMA_ONERISI_BIRLESIK_TASLAK.docx
+++ b/docs/2209-A/ARASTIRMA_ONERISI_BIRLESIK_TASLAK.docx
@@ -20,7 +20,7 @@
           <w:b/>
           <w:bCs/>
         </w:rPr>
-        <w:t xml:space="preserve">Birleşik metin taslağı · 22 Ekim 2026 · Proje başlığı güncellemesi</w:t>
+        <w:t xml:space="preserve">Birleşik metin taslağı · 22 Ekim 2026 · Altı aylık çalışma planı</w:t>
       </w:r>
     </w:p>
     <w:p>
@@ -413,7 +413,7 @@
               <w:rPr>
                 <w:sz w:val="19"/>
               </w:rPr>
-              <w:t xml:space="preserve">Resmî proje süresi</w:t>
+              <w:t xml:space="preserve">Planlanan proje süresi</w:t>
             </w:r>
           </w:p>
         </w:tc>
@@ -432,7 +432,7 @@
               <w:rPr>
                 <w:sz w:val="19"/>
               </w:rPr>
-              <w:t xml:space="preserve">Henüz belirlenmedi.</w:t>
+              <w:t xml:space="preserve">6 ay; resmî takvim sonuçların ilanına göre başlayacaktır.</w:t>
             </w:r>
           </w:p>
         </w:tc>
@@ -520,7 +520,7 @@
         <w:pStyle w:val="BodyText"/>
       </w:pPr>
       <w:r>
-        <w:t xml:space="preserve">Çalışma; donanım ve sensör entegrasyonu, arayüz ve haberleşme, rota izleme, kaçınma ve kontrollü deneyler olmak üzere beş iş paketinde yürütülecektir. Beklenen çıktılar bir araç prototipi, rota arayüzü, deney kayıt kümesi ve performans değerlendirmesiyle birlikte sürümlenmiş teknik dokümantasyondur.</w:t>
+        <w:t xml:space="preserve">Çalışma, altı ay içinde donanım ve sensör entegrasyonu, arayüz ve haberleşme, rota izleme, kaçınma ve kontrollü deneyler olmak üzere beş iş paketinde yürütülecektir. Beklenen çıktılar bir araç prototipi, rota arayüzü, deney kayıt kümesi ve performans değerlendirmesiyle birlikte sürümlenmiş teknik dokümantasyondur.</w:t>
       </w:r>
     </w:p>
     <w:p>
@@ -1718,20 +1718,7 @@
         <w:pStyle w:val="FirstParagraph"/>
       </w:pPr>
       <w:r>
-        <w:t xml:space="preserve">Çalışma beş iş paketinde yürütülecektir. Aşağıdaki dönemler Haziran 2027 bitirme teslim hedefine göre hazırlanmış</w:t>
-      </w:r>
-      <w:r>
-        <w:t xml:space="preserve"> </w:t>
-      </w:r>
-      <w:r>
-        <w:rPr>
-          <w:b/>
-          <w:bCs/>
-        </w:rPr>
-        <w:t xml:space="preserve">akademik plan önerisidir</w:t>
-      </w:r>
-      <w:r>
-        <w:t xml:space="preserve">; resmî TÜBİTAK başlangıcı veya TYBS ay aralıkları değildir. Başvuruya girilecek toplam ay sayısı ve resmî iş paketi aralıkları başvuru öncesinde belirlenecektir. Her iş paketinin uygulama sorumlusu Ahmet Talha Arslan’dır.</w:t>
+        <w:t xml:space="preserve">Projenin planlanan süresi altı aydır. Çalışmalar aşağıdaki beş iş paketinde yürütülecek; ay aralıkları değerlendirme sonuçlarının ilanına göre başlayan proje takvimini gösterecektir. Her iş paketinin uygulama sorumlusu Ahmet Talha Arslan’dır. Akademik danışmanın bilimsel yönlendirme ve incelemesi çalışma boyunca sürecektir.</w:t>
       </w:r>
     </w:p>
     <w:tbl>
@@ -1813,7 +1800,7 @@
                 <w:b/>
                 <w:sz w:val="19"/>
               </w:rPr>
-              <w:t xml:space="preserve">Akademik hedef dönemi</w:t>
+              <w:t xml:space="preserve">Planlanan ay aralığı</w:t>
             </w:r>
           </w:p>
         </w:tc>
@@ -1896,7 +1883,7 @@
               <w:rPr>
                 <w:sz w:val="19"/>
               </w:rPr>
-              <w:t xml:space="preserve">Kasım–Aralık 2026; donanıma erişime bağlı.</w:t>
+              <w:t xml:space="preserve">1–2. ay</w:t>
             </w:r>
           </w:p>
         </w:tc>
@@ -1977,7 +1964,7 @@
               <w:rPr>
                 <w:sz w:val="19"/>
               </w:rPr>
-              <w:t xml:space="preserve">Ocak 2027</w:t>
+              <w:t xml:space="preserve">1–2. ay</w:t>
             </w:r>
           </w:p>
         </w:tc>
@@ -2058,7 +2045,7 @@
               <w:rPr>
                 <w:sz w:val="19"/>
               </w:rPr>
-              <w:t xml:space="preserve">Şubat 2027</w:t>
+              <w:t xml:space="preserve">3. ay</w:t>
             </w:r>
           </w:p>
         </w:tc>
@@ -2139,7 +2126,7 @@
               <w:rPr>
                 <w:sz w:val="19"/>
               </w:rPr>
-              <w:t xml:space="preserve">Mart–Nisan 2027</w:t>
+              <w:t xml:space="preserve">4–5. ay</w:t>
             </w:r>
           </w:p>
         </w:tc>
@@ -2201,7 +2188,7 @@
               <w:rPr>
                 <w:sz w:val="19"/>
               </w:rPr>
-              <w:t xml:space="preserve">Kontrollü deney ve analiz: seçilen 40 deneme, koşul başına ana başarı hedefi ve başarısızlıklar dahil değerlendirme.</w:t>
+              <w:t xml:space="preserve">Kontrollü deney ve analiz: toplam 40 geçerli deneme, her engelli koşulda en az 8/10 birleşik başarı hedefi ve başarısızlıklar dahil değerlendirme.</w:t>
             </w:r>
           </w:p>
         </w:tc>
@@ -2220,7 +2207,7 @@
               <w:rPr>
                 <w:sz w:val="19"/>
               </w:rPr>
-              <w:t xml:space="preserve">Mayıs 2027</w:t>
+              <w:t xml:space="preserve">6. ay</w:t>
             </w:r>
           </w:p>
         </w:tc>
@@ -2250,7 +2237,15 @@
         <w:pStyle w:val="BodyText"/>
       </w:pPr>
       <w:r>
-        <w:t xml:space="preserve">İş paketlerinin başarıya katkıları toplamı %100’dür. Donanıma erişim beklenirken arayüz ve yazılım hazırlığı öne alınabilecektir. Deney ve analizlerin Mayıs ayında, danışman incelemesi ve bitirme tesliminin Haziran ayında tamamlanması hedeflenmektedir. Kesin teslim günü henüz belirlenmemiştir.</w:t>
+        <w:t xml:space="preserve">İş paketlerinin araştırmanın başarısına katkıları toplamı %100’dür. İlk iki ayda donanım ve arayüz çalışmaları kısmen paralel ilerletilecek; donanıma erişim beklenirken arayüzün koordinat ve komut işlevleri üzerinde çalışılabilecektir. Üçüncü aydaki rota takibi, hareket/enkoder kalibrasyonu ve rota aktarımı tamamlandıktan sonra yürütülecektir. Kaçınma davranışının bütünleştirilmesini, son sürümün sabitlenmesi ve altıncı aydaki nihai deneyler izleyecektir. Tek yürütücünün iş yükü bu bağımlılıklar dikkate alınarak düzenlenecektir.</w:t>
+      </w:r>
+    </w:p>
+    <w:p>
+      <w:pPr>
+        <w:pStyle w:val="BodyText"/>
+      </w:pPr>
+      <w:r>
+        <w:t xml:space="preserve">Üniversite bitirme projesi için Haziran 2027 teslimi hedeflenmektedir; kesin gün henüz belirlenmemiştir. Sonuçların ilan tarihi bilinmediğinden altı aylık resmî sürenin takvim üzerindeki bitiş günü şu aşamada belirtilmemektedir. Akademik teslim hedefi ile resmî destek takviminin ilişkisi başvuru öncesinde danışmanla değerlendirilecektir.</w:t>
       </w:r>
     </w:p>
     <w:bookmarkEnd w:id="44"/>

</xml_diff>

<commit_message>
Seçilen 10 cm ve 120 saniye deney hedeflerini rapora işle
</commit_message>
<xml_diff>
--- a/docs/2209-A/ARASTIRMA_ONERISI_BIRLESIK_TASLAK.docx
+++ b/docs/2209-A/ARASTIRMA_ONERISI_BIRLESIK_TASLAK.docx
@@ -20,7 +20,7 @@
           <w:b/>
           <w:bCs/>
         </w:rPr>
-        <w:t xml:space="preserve">Birleşik metin taslağı · 22 Ekim 2026 · Altı aylık çalışma planı</w:t>
+        <w:t xml:space="preserve">Birleşik metin taslağı · 22 Ekim 2026 · Deney hedefleri güncellemesi</w:t>
       </w:r>
     </w:p>
     <w:p>
@@ -512,7 +512,7 @@
         <w:pStyle w:val="BodyText"/>
       </w:pPr>
       <w:r>
-        <w:t xml:space="preserve">Düz zeminde yaklaşık 3 × 3 metre olarak planlanan alanda engelsiz referans ve üç sabit engel yerleşimi karşılaştırılacaktır. Her koşul 10 kez tekrarlanarak toplam 40 geçerli değerlendirme denemesi yapılacaktır. Her engelli koşulda en az 8/10 denemede temas öncesi algılama, çarpışmasız kaçınma, rotaya dönüş ve hedefe ulaşmanın birlikte sağlanması hedeflenmektedir. Aracın hareketinin bağımsız değerlendirilmesinde, mevcut telefonla sabit görüntü kaydı ve kalibrasyon düzeni kurulması planlanmaktadır.</w:t>
+        <w:t xml:space="preserve">Düz zeminde yaklaşık 3 × 3 metre olarak planlanan alanda engelsiz referans ve üç sabit engel yerleşimi karşılaştırılacaktır. Her koşul 10 kez tekrarlanarak toplam 40 geçerli değerlendirme denemesi yapılacaktır. Her engelli koşulda en az 8/10 denemede temas öncesi algılama, çarpışmasız kaçınma, rotaya dönüş ve hedefe ulaşmanın birlikte sağlanması hedeflenmektedir. Waypoint erişimi ve rotaya dönüş için en çok 10 cm uzaklık, deneme başına en çok 120 saniye hedeflenmektedir. Aracın hareketinin bağımsız değerlendirilmesinde, mevcut telefonla sabit görüntü kaydı ve kalibrasyon düzeni kurulması planlanmaktadır.</w:t>
       </w:r>
     </w:p>
     <w:p>
@@ -710,7 +710,7 @@
         </w:numPr>
       </w:pPr>
       <w:r>
-        <w:t xml:space="preserve">Her engelli koşulda en az 8/10 denemede temas öncesi algılama, çarpışmasız kaçınma, rotaya dönüş ve hedefe ulaşmayı birlikte sağlamak; tüm geçerli başarısızlıkları da değerlendirmeye katmak.</w:t>
+        <w:t xml:space="preserve">Her engelli koşulda en az 8/10 denemede temas öncesi algılama, çarpışmasız kaçınma, rotaya dönüş ve hedefe ulaşmayı 120 saniye içinde birlikte sağlamak; tüm geçerli başarısızlıkları da değerlendirmeye katmak.</w:t>
       </w:r>
     </w:p>
     <w:p>
@@ -730,7 +730,7 @@
         <w:pStyle w:val="FirstParagraph"/>
       </w:pPr>
       <w:r>
-        <w:t xml:space="preserve">Waypoint erişim toleransı, rotaya dönüş ölçütleri ve deneme süre sınırı; ölçüm düzeninin duyarlılığı, donanım özellikleri ve danışman değerlendirmesiyle başvuru öncesinde kesinleştirilecektir.</w:t>
+        <w:t xml:space="preserve">Waypoint erişimi ve rotaya dönüş için 10 cm tolerans, her deneme için 120 saniye üst sınırı planlanmıştır. Bu hedeflerin uygulanabilirliği, donanım özellikleri ve bağımsız ölçüm düzeniyle değerlendirilecek; kalan durum geçişi ve kalibrasyon parametreleri başvuru öncesinde danışmanla gözden geçirilecektir.</w:t>
       </w:r>
     </w:p>
     <w:bookmarkEnd w:id="24"/>
@@ -1497,7 +1497,285 @@
         <w:pStyle w:val="BodyText"/>
       </w:pPr>
       <w:r>
-        <w:t xml:space="preserve">Waypoint erişimi ve rotaya dönüş için kullanılacak toleranslar ile deneme süre sınırı, ölçüm duyarlılığı ve donanım özellikleriyle gerekçelendirilecektir. Başvuruda kullanılacak sayısal değerler, ölçüm düzeninin uygulanabilirliği ve danışman değerlendirmesiyle kesinleştirilecektir.</w:t>
+        <w:t xml:space="preserve">Planlanan sayısal değerlendirme ölçütleri aşağıdadır. Bunlar prototipte elde edilmiş performans değerleri değildir.</w:t>
+      </w:r>
+    </w:p>
+    <w:tbl>
+      <w:tblPr>
+        <w:tblStyle w:val="TableGrid"/>
+        <w:tblW w:type="pct" w:w="5000"/>
+        <w:jc w:val="left"/>
+        <w:tblLayout w:type="fixed"/>
+        <w:tblLook w:firstRow="1" w:lastRow="0" w:firstColumn="0" w:lastColumn="0" w:noHBand="0" w:noVBand="0" w:val="0020"/>
+      </w:tblPr>
+      <w:tblGrid>
+        <w:gridCol w:w="1701"/>
+        <w:gridCol w:w="3175"/>
+        <w:gridCol w:w="4762"/>
+      </w:tblGrid>
+      <w:tr>
+        <w:trPr>
+          <w:tblHeader w:val="on"/>
+          <w:tblHeader/>
+          <w:cantSplit/>
+        </w:trPr>
+        <w:tc>
+          <w:tcPr>
+            <w:tcW w:type="dxa" w:w="1701"/>
+            <w:vAlign w:val="top"/>
+            <w:shd w:fill="EAF1F7"/>
+          </w:tcPr>
+          <w:p>
+            <w:pPr>
+              <w:pStyle w:val="Compact"/>
+              <w:spacing w:after="60" w:line="252" w:lineRule="auto"/>
+              <w:jc w:val="left"/>
+            </w:pPr>
+            <w:r>
+              <w:rPr>
+                <w:b/>
+                <w:sz w:val="19"/>
+              </w:rPr>
+              <w:t xml:space="preserve">Ölçüt</w:t>
+            </w:r>
+          </w:p>
+        </w:tc>
+        <w:tc>
+          <w:tcPr>
+            <w:tcW w:type="dxa" w:w="3175"/>
+            <w:vAlign w:val="top"/>
+            <w:shd w:fill="EAF1F7"/>
+          </w:tcPr>
+          <w:p>
+            <w:pPr>
+              <w:pStyle w:val="Compact"/>
+              <w:spacing w:after="60" w:line="252" w:lineRule="auto"/>
+              <w:jc w:val="left"/>
+            </w:pPr>
+            <w:r>
+              <w:rPr>
+                <w:b/>
+                <w:sz w:val="19"/>
+              </w:rPr>
+              <w:t xml:space="preserve">Planlanan hedef</w:t>
+            </w:r>
+          </w:p>
+        </w:tc>
+        <w:tc>
+          <w:tcPr>
+            <w:tcW w:type="dxa" w:w="4762"/>
+            <w:vAlign w:val="top"/>
+            <w:shd w:fill="EAF1F7"/>
+          </w:tcPr>
+          <w:p>
+            <w:pPr>
+              <w:pStyle w:val="Compact"/>
+              <w:spacing w:after="60" w:line="252" w:lineRule="auto"/>
+              <w:jc w:val="left"/>
+            </w:pPr>
+            <w:r>
+              <w:rPr>
+                <w:b/>
+                <w:sz w:val="19"/>
+              </w:rPr>
+              <w:t xml:space="preserve">Değerlendirme tanımı</w:t>
+            </w:r>
+          </w:p>
+        </w:tc>
+      </w:tr>
+      <w:tr>
+        <w:trPr>
+          <w:cantSplit/>
+        </w:trPr>
+        <w:tc>
+          <w:tcPr>
+            <w:tcW w:type="dxa" w:w="1701"/>
+            <w:vAlign w:val="top"/>
+          </w:tcPr>
+          <w:p>
+            <w:pPr>
+              <w:pStyle w:val="Compact"/>
+              <w:spacing w:after="60" w:line="252" w:lineRule="auto"/>
+              <w:jc w:val="left"/>
+            </w:pPr>
+            <w:r>
+              <w:rPr>
+                <w:sz w:val="19"/>
+              </w:rPr>
+              <w:t xml:space="preserve">Waypoint erişimi</w:t>
+            </w:r>
+          </w:p>
+        </w:tc>
+        <w:tc>
+          <w:tcPr>
+            <w:tcW w:type="dxa" w:w="3175"/>
+            <w:vAlign w:val="top"/>
+          </w:tcPr>
+          <w:p>
+            <w:pPr>
+              <w:pStyle w:val="Compact"/>
+              <w:spacing w:after="60" w:line="252" w:lineRule="auto"/>
+              <w:jc w:val="left"/>
+            </w:pPr>
+            <w:r>
+              <w:rPr>
+                <w:sz w:val="19"/>
+              </w:rPr>
+              <w:t xml:space="preserve">En çok 10 cm</w:t>
+            </w:r>
+          </w:p>
+        </w:tc>
+        <w:tc>
+          <w:tcPr>
+            <w:tcW w:type="dxa" w:w="4762"/>
+            <w:vAlign w:val="top"/>
+          </w:tcPr>
+          <w:p>
+            <w:pPr>
+              <w:pStyle w:val="Compact"/>
+              <w:spacing w:after="60" w:line="252" w:lineRule="auto"/>
+              <w:jc w:val="left"/>
+            </w:pPr>
+            <w:r>
+              <w:rPr>
+                <w:sz w:val="19"/>
+              </w:rPr>
+              <w:t xml:space="preserve">Araç referans noktasının sıradaki waypoint veya son hedef noktasına Öklid uzaklığı.</w:t>
+            </w:r>
+          </w:p>
+        </w:tc>
+      </w:tr>
+      <w:tr>
+        <w:trPr>
+          <w:cantSplit/>
+        </w:trPr>
+        <w:tc>
+          <w:tcPr>
+            <w:tcW w:type="dxa" w:w="1701"/>
+            <w:vAlign w:val="top"/>
+          </w:tcPr>
+          <w:p>
+            <w:pPr>
+              <w:pStyle w:val="Compact"/>
+              <w:spacing w:after="60" w:line="252" w:lineRule="auto"/>
+              <w:jc w:val="left"/>
+            </w:pPr>
+            <w:r>
+              <w:rPr>
+                <w:sz w:val="19"/>
+              </w:rPr>
+              <w:t xml:space="preserve">Rotaya dönüş</w:t>
+            </w:r>
+          </w:p>
+        </w:tc>
+        <w:tc>
+          <w:tcPr>
+            <w:tcW w:type="dxa" w:w="3175"/>
+            <w:vAlign w:val="top"/>
+          </w:tcPr>
+          <w:p>
+            <w:pPr>
+              <w:pStyle w:val="Compact"/>
+              <w:spacing w:after="60" w:line="252" w:lineRule="auto"/>
+              <w:jc w:val="left"/>
+            </w:pPr>
+            <w:r>
+              <w:rPr>
+                <w:sz w:val="19"/>
+              </w:rPr>
+              <w:t xml:space="preserve">En çok 10 cm</w:t>
+            </w:r>
+          </w:p>
+        </w:tc>
+        <w:tc>
+          <w:tcPr>
+            <w:tcW w:type="dxa" w:w="4762"/>
+            <w:vAlign w:val="top"/>
+          </w:tcPr>
+          <w:p>
+            <w:pPr>
+              <w:pStyle w:val="Compact"/>
+              <w:spacing w:after="60" w:line="252" w:lineRule="auto"/>
+              <w:jc w:val="left"/>
+            </w:pPr>
+            <w:r>
+              <w:rPr>
+                <w:sz w:val="19"/>
+              </w:rPr>
+              <w:t xml:space="preserve">Araç referans noktasının etkin sonlu rota parçasına uzaklığı. Engel geride bırakılmış, gövde için geçiş açık ve hedef yönünde ilerleme sürüyor olacak.</w:t>
+            </w:r>
+          </w:p>
+        </w:tc>
+      </w:tr>
+      <w:tr>
+        <w:trPr>
+          <w:cantSplit/>
+        </w:trPr>
+        <w:tc>
+          <w:tcPr>
+            <w:tcW w:type="dxa" w:w="1701"/>
+            <w:vAlign w:val="top"/>
+          </w:tcPr>
+          <w:p>
+            <w:pPr>
+              <w:pStyle w:val="Compact"/>
+              <w:spacing w:after="60" w:line="252" w:lineRule="auto"/>
+              <w:jc w:val="left"/>
+            </w:pPr>
+            <w:r>
+              <w:rPr>
+                <w:sz w:val="19"/>
+              </w:rPr>
+              <w:t xml:space="preserve">Deneme süresi</w:t>
+            </w:r>
+          </w:p>
+        </w:tc>
+        <w:tc>
+          <w:tcPr>
+            <w:tcW w:type="dxa" w:w="3175"/>
+            <w:vAlign w:val="top"/>
+          </w:tcPr>
+          <w:p>
+            <w:pPr>
+              <w:pStyle w:val="Compact"/>
+              <w:spacing w:after="60" w:line="252" w:lineRule="auto"/>
+              <w:jc w:val="left"/>
+            </w:pPr>
+            <w:r>
+              <w:rPr>
+                <w:sz w:val="19"/>
+              </w:rPr>
+              <w:t xml:space="preserve">En çok 120 saniye</w:t>
+            </w:r>
+          </w:p>
+        </w:tc>
+        <w:tc>
+          <w:tcPr>
+            <w:tcW w:type="dxa" w:w="4762"/>
+            <w:vAlign w:val="top"/>
+          </w:tcPr>
+          <w:p>
+            <w:pPr>
+              <w:pStyle w:val="Compact"/>
+              <w:spacing w:after="60" w:line="252" w:lineRule="auto"/>
+              <w:jc w:val="left"/>
+            </w:pPr>
+            <w:r>
+              <w:rPr>
+                <w:sz w:val="19"/>
+              </w:rPr>
+              <w:t xml:space="preserve">Hareketin başlamasından sıralı waypoint’ler üzerinden son hedefe erişilerek görevin tamamlanmasına kadar geçen süre.</w:t>
+            </w:r>
+          </w:p>
+        </w:tc>
+      </w:tr>
+    </w:tbl>
+    <w:p>
+      <w:pPr>
+        <w:pStyle w:val="BodyText"/>
+      </w:pPr>
+      <w:r>
+        <w:t xml:space="preserve">10 cm değeri waypoint erişimi ve rotaya dönüş için kullanılacaktır; tüm hareket boyunca rota hatasının bu değerin altında kaldığı varsayılmayacaktır. Ölçüm belirsizliği kaydedilecek ve eşik çevresindeki kararlar bu belirsizlikle değerlendirilecektir. Bantta kalma ve son hedefte durma süreleri, ilerleme kontrolü ve diğer kalibrasyon parametreleri ayrıca tanımlanacaktır. Seçilen hedeflerin uygulanabilirliği, bağımsız ölçüm düzeni ve danışman incelemesiyle değerlendirilecektir.</w:t>
       </w:r>
     </w:p>
     <w:bookmarkEnd w:id="40"/>

</xml_diff>

<commit_message>
Seçilen 11500 TL bütçeyi rapora işle ve ilk sayfa yerleşimini düzenle
</commit_message>
<xml_diff>
--- a/docs/2209-A/ARASTIRMA_ONERISI_BIRLESIK_TASLAK.docx
+++ b/docs/2209-A/ARASTIRMA_ONERISI_BIRLESIK_TASLAK.docx
@@ -20,7 +20,7 @@
           <w:b/>
           <w:bCs/>
         </w:rPr>
-        <w:t xml:space="preserve">Birleşik metin taslağı · 22 Ekim 2026 · Deney hedefleri güncellemesi</w:t>
+        <w:t xml:space="preserve">Birleşik metin taslağı · 22 Ekim 2026 · Seçilen bütçe güncellemesi</w:t>
       </w:r>
     </w:p>
     <w:p>
@@ -46,7 +46,7 @@
         <w:pStyle w:val="BodyText"/>
       </w:pPr>
       <w:r>
-        <w:t xml:space="preserve">Bu belge, planlanan araştırmanın inceleme taslağıdır. Başvuru öncesinde tamamlanacak bilgiler ve belge hazırlama kayıtları</w:t>
+        <w:t xml:space="preserve">İnceleme taslağıdır; açık bilgiler</w:t>
       </w:r>
       <w:r>
         <w:t xml:space="preserve"> </w:t>
@@ -56,7 +56,7 @@
           <w:rPr>
             <w:rStyle w:val="Hyperlink"/>
           </w:rPr>
-          <w:t xml:space="preserve">ayrı hazırlık notunda</w:t>
+          <w:t xml:space="preserve">hazırlık notlarında</w:t>
         </w:r>
       </w:hyperlink>
       <w:r>
@@ -456,7 +456,7 @@
               <w:rPr>
                 <w:sz w:val="19"/>
               </w:rPr>
-              <w:t xml:space="preserve">Talep edilecek destek</w:t>
+              <w:t xml:space="preserve">Planlanan destek talebi</w:t>
             </w:r>
           </w:p>
         </w:tc>
@@ -475,7 +475,7 @@
               <w:rPr>
                 <w:sz w:val="19"/>
               </w:rPr>
-              <w:t xml:space="preserve">Nihai bütçe henüz belirlenmedi.</w:t>
+              <w:t xml:space="preserve">11.500 TL; KDV dahil tahmini bütçe.</w:t>
             </w:r>
           </w:p>
         </w:tc>
@@ -496,7 +496,7 @@
         <w:pStyle w:val="FirstParagraph"/>
       </w:pPr>
       <w:r>
-        <w:t xml:space="preserve">Bu araştırmada, kullanıcı tarafından arayüzde tanımlanan bir rotayı izleyen, karşılaştığı sabit engelleri algılayarak çarpışmadan kaçınan ve ardından rotasına yeniden katılan küçük ölçekli bir otonom kara aracı geliştirilmesi amaçlanmaktadır. Araştırma, farklı engel yerleşimlerinin algılama, kaçınma, rotaya dönüş ve görev tamamlama davranışına etkisini kontrollü deneylerle inceleyecektir.</w:t>
+        <w:t xml:space="preserve">Bu araştırmada, kullanıcı tarafından arayüzde tanımlanan rotayı izleyen, sabit engelleri algılayıp çarpışmadan kaçınarak rotasına dönen küçük ölçekli bir otonom kara aracı geliştirilmesi amaçlanmaktadır. Farklı engel yerleşimlerinin algılama, kaçınma, rotaya dönüş ve görev tamamlama başarısına etkisi kontrollü deneylerle incelenecektir.</w:t>
       </w:r>
     </w:p>
     <w:p>
@@ -504,7 +504,7 @@
         <w:pStyle w:val="BodyText"/>
       </w:pPr>
       <w:r>
-        <w:t xml:space="preserve">Prototip; ESP32 kontrol birimi, bağımsız sürülen iki enkoderli motor ve ön orta, iki ön çapraz ve iki yan yönde yerleştirilecek beş sabit mesafe sensöründen oluşacaktır. Kullanıcı, bilgisayar öncelikli ve telefondan erişimi de hedeflenen arayüzde yerel koordinatlarla ara rota noktaları (waypoint) belirleyecektir. Enkoder verilerinden hesaplanan göreli konum bilgisi, mesafe ölçümlerine dayalı hareket kararlarıyla birlikte kullanılacaktır. Engel çevresini takip etme ve rotaya dönüş davranışları, Bug 2 yaklaşımından yararlanan bir durum makinesiyle gerçekleştirilecektir.</w:t>
+        <w:t xml:space="preserve">Prototip; ESP32 kontrol birimi, bağımsız sürülen iki enkoderli motor ve beş sabit mesafe sensöründen oluşacaktır. Kullanıcı, bilgisayar öncelikli ve telefondan erişimi de hedeflenen arayüzde yerel koordinatlarla ara rota noktaları (waypoint) belirleyecektir. Enkoder verilerinden hesaplanan göreli konum bilgisi, mesafe ölçümlerine dayalı hareket kararlarıyla birlikte kullanılacaktır. Engel çevresini takip etme ve rotaya dönüş davranışları, Bug 2 yaklaşımından yararlanan bir durum makinesiyle gerçekleştirilecektir.</w:t>
       </w:r>
     </w:p>
     <w:p>
@@ -520,7 +520,7 @@
         <w:pStyle w:val="BodyText"/>
       </w:pPr>
       <w:r>
-        <w:t xml:space="preserve">Çalışma, altı ay içinde donanım ve sensör entegrasyonu, arayüz ve haberleşme, rota izleme, kaçınma ve kontrollü deneyler olmak üzere beş iş paketinde yürütülecektir. Beklenen çıktılar bir araç prototipi, rota arayüzü, deney kayıt kümesi ve performans değerlendirmesiyle birlikte sürümlenmiş teknik dokümantasyondur.</w:t>
+        <w:t xml:space="preserve">Çalışma, altı aylık beş iş paketinde yürütülecektir. Beklenen çıktılar bir araç prototipi, rota arayüzü, deney kayıt kümesi ve performans değerlendirmesiyle birlikte sürümlenmiş teknik dokümantasyondur.</w:t>
       </w:r>
     </w:p>
     <w:p>

</xml_diff>

<commit_message>
Üçüncü örnek öneriyi incele ve bilimsel metnin bölüm düzenini geliştir
</commit_message>
<xml_diff>
--- a/docs/2209-A/ARASTIRMA_ONERISI_BIRLESIK_TASLAK.docx
+++ b/docs/2209-A/ARASTIRMA_ONERISI_BIRLESIK_TASLAK.docx
@@ -20,7 +20,7 @@
           <w:b/>
           <w:bCs/>
         </w:rPr>
-        <w:t xml:space="preserve">Birleşik metin taslağı · 22 Ekim 2026 · Seçilen bütçe güncellemesi</w:t>
+        <w:t xml:space="preserve">Birleşik metin taslağı · 22 Ekim 2026 · Anlatım ve bölüm düzeni güncellemesi</w:t>
       </w:r>
     </w:p>
     <w:p>
@@ -566,7 +566,11 @@
         <w:pStyle w:val="FirstParagraph"/>
       </w:pPr>
       <w:r>
-        <w:t xml:space="preserve">Otonom kara araçlarında rota takibi, aracın konum ve yön bilgisinin hareket kontrolüyle birlikte değerlendirilmesini gerektirir. İki tekeri bağımsız sürülen mobil robotların kinematik modeli, tekerleklerin hareketi ile aracın doğrusal ve açısal hareketi arasındaki ilişkiyi tanımlar. Bu nedenle kullanıcı tarafından belirlenen bir rotanın fiziksel ortamda izlenmesi, yalnızca hareket komutlarının gönderilmesine değil, aracın yöneliminin ve hareketinin uygun biçimde izlenmesine de bağlıdır (Dellaert ve Hutchinson, t.y.). Rota üzerinde engel bulunması durumunda ise aracın engeli algılaması, çarpışmadan kaçınacak bir hareket üretmesi ve hedefe ilerleyişini sürdürebilmesi gerekir.</w:t>
+        <w:rPr>
+          <w:b/>
+          <w:bCs/>
+        </w:rPr>
+        <w:t xml:space="preserve">Araştırma problemi ve önemi</w:t>
       </w:r>
     </w:p>
     <w:p>
@@ -574,7 +578,7 @@
         <w:pStyle w:val="BodyText"/>
       </w:pPr>
       <w:r>
-        <w:t xml:space="preserve">Hareket planlama literatüründe yerel engel bilgisini kullanan Bug türü yöntemler, önceden tüm engellerin haritası bilinmeden hedefe yönelik hareketin ele alınabildiği yaklaşımlar arasındadır. Bu yöntemlerin incelenmesinde robotun konumuna, engel geometrisine ve algılama biçimine ilişkin varsayımlar önem taşır. Ayrıca robotun fiziksel boyutlarının dikkate alınması, noktasal bir modelle bulunan yolun gerçek bir araçta uygulanabilirliğinin değerlendirilmesi açısından gereklidir (Hauser, t.y.-a).</w:t>
+        <w:t xml:space="preserve">Otonom kara araçlarında rota takibi, aracın konum ve yön bilgisinin hareket kontrolüyle birlikte değerlendirilmesini gerektirir. İki tekeri bağımsız sürülen mobil robotların kinematik modeli, tekerleklerin hareketi ile aracın doğrusal ve açısal hareketi arasındaki ilişkiyi tanımlar. Bu nedenle kullanıcı tarafından belirlenen bir rotanın fiziksel ortamda izlenmesi, yalnızca hareket komutlarının gönderilmesine değil, aracın yöneliminin ve hareketinin uygun biçimde izlenmesine de bağlıdır (Dellaert ve Hutchinson, t.y.). Rota üzerinde engel bulunması durumunda ise aracın engeli algılaması, çarpışmadan kaçınacak bir hareket üretmesi ve hedefe ilerleyişini sürdürebilmesi gerekir.</w:t>
       </w:r>
     </w:p>
     <w:p>
@@ -582,7 +586,11 @@
         <w:pStyle w:val="BodyText"/>
       </w:pPr>
       <w:r>
-        <w:t xml:space="preserve">Alajlan vd. (2017), FEZ Cerbot platformunda kızılötesi sensörler, ultrasonik sensör ve araç üzeri kamerayı birleştirerek sabit ve kısmen dinamik engelli senaryoları incelemiştir. Bu çalışma, algılama kapsamının hareket kararlarıyla birlikte tasarlanmasına örnek oluşturmaktadır. Bu araştırmada ise beş sabit mesafe sensörünün sağladığı yerel bilgiyle sabit engeller çevresinde kaçınma davranışı değerlendirilecektir. Telefonla yapılacak görüntü kaydı, aracın hareketini bağımsız olarak ölçmek amacıyla kullanılacaktır. Algılama altyapısı ve deney koşulları farklı olduğundan, ilgili yayındaki performans sonuçları bu prototip için öngörülen başarı değerleri olarak alınmayacaktır.</w:t>
+        <w:rPr>
+          <w:b/>
+          <w:bCs/>
+        </w:rPr>
+        <w:t xml:space="preserve">Literatürdeki yaklaşımlar ve projenin konumu</w:t>
       </w:r>
     </w:p>
     <w:p>
@@ -590,7 +598,35 @@
         <w:pStyle w:val="BodyText"/>
       </w:pPr>
       <w:r>
+        <w:t xml:space="preserve">Hareket planlama literatüründe yerel engel bilgisini kullanan Bug türü yöntemler, önceden tüm engellerin haritası bilinmeden hedefe yönelik hareketin ele alınabildiği yaklaşımlar arasındadır. Bu yöntemlerin incelenmesinde robotun konumuna, engel geometrisine ve algılama biçimine ilişkin varsayımlar önem taşır. Ayrıca robotun fiziksel boyutlarının dikkate alınması, noktasal bir modelle bulunan yolun gerçek bir araçta uygulanabilirliğinin değerlendirilmesi açısından gereklidir (Hauser, t.y.-a).</w:t>
+      </w:r>
+    </w:p>
+    <w:p>
+      <w:pPr>
+        <w:pStyle w:val="BodyText"/>
+      </w:pPr>
+      <w:r>
+        <w:t xml:space="preserve">Alajlan vd. (2017), FEZ Cerbot platformunda kızılötesi sensörler, ultrasonik sensör ve araç üzeri kamerayı birleştirerek sabit ve kısmen dinamik engelli senaryoları incelemiştir. Bu çalışma, algılama kapsamının hareket kararlarıyla birlikte tasarlanmasına örnek oluşturmaktadır. Bu araştırmada ise beş sabit mesafe sensörünün sağladığı yerel bilgiyle sabit engeller çevresinde kaçınma davranışı değerlendirilecektir. Telefonla yapılacak görüntü kaydı, aracın hareketini bağımsız olarak ölçmek amacıyla kullanılacaktır. Algılama altyapısı ve deney koşulları farklı olduğundan, ilgili yayındaki performans sonuçları bu prototip için öngörülen başarı değerleri olarak alınmayacaktır.</w:t>
+      </w:r>
+    </w:p>
+    <w:p>
+      <w:pPr>
+        <w:pStyle w:val="BodyText"/>
+      </w:pPr>
+      <w:r>
         <w:t xml:space="preserve">Koordinat tabanlı uygulamalarda Iqbal vd. (2023), yapı modelinden çıkarılan koordinatların masaüstü uygulaması ve bulut bağlantısı üzerinden ESP32 tabanlı bir mobil robota aktarılmasıyla zemin çizimi gerçekleştiren bir sistem sunmuştur. Rodrigues vd. (2026) ise enkoderler, dış kamera temelli konum bilgisi ve ESP32 gömülü kontrol katmanını içeren küçük bir diferansiyel sürüşlü robotta yörünge takibini deneysel olarak değerlendirmiştir. Bu örnekler, koordinat aktarımı, konum bilgisi ve motor kontrolünün farklı mimarilerle bütünleştirilebildiğini göstermektedir. Önerilen projede ele alınacak değerlendirme görevi, kullanıcının tanımladığı rota üzerinde yerel algıyla engelden kaçınma ve rotaya yeniden katılmadır. Çalışmanın bilimsel çerçevesi, bu davranışın seçilen donanım ve sınırlı deney koşullarında hangi aşamalarda başarılı veya başarısız olduğunun tekrarlı ölçümlerle incelenmesine dayanmaktadır.</w:t>
+      </w:r>
+    </w:p>
+    <w:p>
+      <w:pPr>
+        <w:pStyle w:val="BodyText"/>
+      </w:pPr>
+      <w:r>
+        <w:rPr>
+          <w:b/>
+          <w:bCs/>
+        </w:rPr>
+        <w:t xml:space="preserve">Araştırma sorusu, kapsam ve beklenen katkı</w:t>
       </w:r>
     </w:p>
     <w:p>
@@ -768,6 +804,14 @@
       </w:pPr>
       <w:r>
         <w:t xml:space="preserve">Başlangıç konumu ve yönü, referans rota, zemin, hız ayarı ve kontrol parametreleri koşullar arasında sabit tutulacak; pil gerilimi, aydınlatma ve kontrol edilemeyen değişimler kaydedilecektir. Yaklaşık 3 × 3 metre olarak planlanan alanın fiziksel yeri henüz belirlenmemiştir. Alanın yeterliliği, şasi boyutları ve engel çevresindeki geçiş açıklıkları birlikte değerlendirilerek kontrol edilecektir.</w:t>
+      </w:r>
+    </w:p>
+    <w:p>
+      <w:pPr>
+        <w:pStyle w:val="BodyText"/>
+      </w:pPr>
+      <w:r>
+        <w:t xml:space="preserve">Hedeflere ulaşmak için arayüz ve rota aktarımı İP2, motor/enkoder ve sensör kalibrasyonu İP1, konum kestirimi ve rota takibi İP3, kaçınma ve rotaya dönüş İP4 kapsamında geliştirilecektir. Bu bileşenlerin birlikte çalışması, İP5 kapsamında dört koşuldaki toplam 40 denemeyle değerlendirilecektir. Böylece donanımın kurulması ile otonom görevin başarıyla tamamlanması ayrı aşamalarda kontrol edilecek; sonuçlar Bölüm 2.6–2.7’de tanımlanan ölçütlerle raporlanacaktır.</w:t>
       </w:r>
     </w:p>
     <w:bookmarkEnd w:id="26"/>

</xml_diff>